<commit_message>
IT Cálculo dos Indicadores do PVP (IT.DL.PL.003); Analisar PVP volta ao original
Documento à parte, só com a explicação simples dos cálculos de cada
indicador (gerais, C.C., material em risco, MOD, trabalho extra e anexo do
Histórico), com imagens ilustrativas. A IT Analisar PVP volta a ser a
versão original do utilizador.

Co-Authored-By: Claude Opus 5.5 <noreply@anthropic.com>
Claude-Session: https://claude.ai/code/session_01S5dQPeCkEovFL6vojBFBfd
</commit_message>
<xml_diff>
--- a/IT_Analisar_PVP.docx
+++ b/IT_Analisar_PVP.docx
@@ -13,6 +13,7 @@
           <w:lang w:val="pt-PT"/>
         </w:rPr>
       </w:pPr>
+      <w:bookmarkStart w:id="0" w:name="_Toc341859629"/>
       <w:r>
         <w:rPr>
           <w:rFonts w:cs="Segoe UI"/>
@@ -43,23 +44,15 @@
     </w:p>
     <w:p>
       <w:pPr>
-        <w:spacing w:after="60"/>
-        <w:ind w:left="0"/>
+        <w:ind w:firstLine="709"/>
         <w:jc w:val="both"/>
-        <w:rPr>
-          <w:sz w:val="20"/>
-          <w:lang w:val="pt-PT"/>
-        </w:rPr>
-      </w:pPr>
-      <w:r>
         <w:rPr>
           <w:rFonts w:cs="Segoe UI"/>
           <w:sz w:val="20"/>
           <w:szCs w:val="20"/>
           <w:lang w:val="pt-PT"/>
         </w:rPr>
-        <w:t xml:space="preserve">Em cada passo é indicado o que verificar, o que o ecrã mostra e, de forma simples, de onde vêm os valores. As imagens são exemplos ilustrativos (dados fictícios).</w:t>
-      </w:r>
+      </w:pPr>
     </w:p>
     <w:p>
       <w:pPr>
@@ -68,8 +61,8 @@
           <w:ilvl w:val="0"/>
           <w:numId w:val="27"/>
         </w:numPr>
-        <w:spacing w:before="240"/>
         <w:rPr>
+          <w:rFonts w:cs="Segoe UI"/>
           <w:sz w:val="20"/>
           <w:lang w:val="pt-PT"/>
         </w:rPr>
@@ -78,10 +71,17 @@
         <w:rPr>
           <w:rFonts w:cs="Segoe UI"/>
           <w:sz w:val="20"/>
-          <w:szCs w:val="20"/>
           <w:lang w:val="pt-PT"/>
         </w:rPr>
-        <w:t xml:space="preserve">Abrir a página de SharePoint referente ao PVP.</w:t>
+        <w:t xml:space="preserve">Abrir a página de SharePoint referente </w:t>
+      </w:r>
+      <w:r>
+        <w:rPr>
+          <w:rFonts w:cs="Segoe UI"/>
+          <w:sz w:val="20"/>
+          <w:lang w:val="pt-PT"/>
+        </w:rPr>
+        <w:t>ao PVP.</w:t>
       </w:r>
     </w:p>
     <w:p>
@@ -115,20 +115,54 @@
     </w:p>
     <w:p>
       <w:pPr>
-        <w:keepNext/>
-        <w:spacing w:before="120" w:after="60"/>
-        <w:jc w:val="center"/>
+        <w:pStyle w:val="ListParagraph"/>
+        <w:rPr>
+          <w:rFonts w:cs="Segoe UI"/>
+          <w:sz w:val="20"/>
+          <w:lang w:val="pt-PT"/>
+        </w:rPr>
+      </w:pPr>
+    </w:p>
+    <w:p>
+      <w:pPr>
+        <w:pStyle w:val="ListParagraph"/>
+        <w:rPr>
+          <w:rFonts w:cs="Segoe UI"/>
+          <w:sz w:val="20"/>
+          <w:lang w:val="pt-PT"/>
+        </w:rPr>
       </w:pPr>
       <w:r>
         <w:rPr>
+          <w:rFonts w:cs="Segoe UI"/>
+          <w:b/>
+          <w:bCs/>
           <w:noProof/>
+          <w:sz w:val="18"/>
+          <w:szCs w:val="22"/>
           <w:lang w:val="pt-PT"/>
         </w:rPr>
         <w:drawing>
-          <wp:inline distT="0" distB="0" distL="0" distR="0">
-            <wp:extent cx="6120000" cy="3442500"/>
-            <wp:effectExtent l="0" t="0" r="0" b="0"/>
-            <wp:docPr id="9000" name="Imagem 9000"/>
+          <wp:anchor distT="0" distB="0" distL="114300" distR="114300" simplePos="0" relativeHeight="251934720" behindDoc="1" locked="0" layoutInCell="1" allowOverlap="1" wp14:anchorId="23109EBC" wp14:editId="6E5E0175">
+            <wp:simplePos x="0" y="0"/>
+            <wp:positionH relativeFrom="margin">
+              <wp:posOffset>238125</wp:posOffset>
+            </wp:positionH>
+            <wp:positionV relativeFrom="paragraph">
+              <wp:posOffset>8890</wp:posOffset>
+            </wp:positionV>
+            <wp:extent cx="6132830" cy="2256155"/>
+            <wp:effectExtent l="0" t="0" r="1270" b="0"/>
+            <wp:wrapTight wrapText="bothSides">
+              <wp:wrapPolygon edited="0">
+                <wp:start x="0" y="0"/>
+                <wp:lineTo x="0" y="21339"/>
+                <wp:lineTo x="21537" y="21339"/>
+                <wp:lineTo x="21537" y="0"/>
+                <wp:lineTo x="0" y="0"/>
+              </wp:wrapPolygon>
+            </wp:wrapTight>
+            <wp:docPr id="1446268508" name="Picture 1"/>
             <wp:cNvGraphicFramePr>
               <a:graphicFrameLocks xmlns:a="http://schemas.openxmlformats.org/drawingml/2006/main" noChangeAspect="1"/>
             </wp:cNvGraphicFramePr>
@@ -136,11 +170,17 @@
               <a:graphicData uri="http://schemas.openxmlformats.org/drawingml/2006/picture">
                 <pic:pic xmlns:pic="http://schemas.openxmlformats.org/drawingml/2006/picture">
                   <pic:nvPicPr>
-                    <pic:cNvPr id="9000" name="pvp_01_pagina.png"/>
+                    <pic:cNvPr id="1175323663" name=""/>
                     <pic:cNvPicPr/>
                   </pic:nvPicPr>
                   <pic:blipFill>
-                    <a:blip r:embed="rId500"/>
+                    <a:blip r:embed="rId15" cstate="print">
+                      <a:extLst>
+                        <a:ext uri="{28A0092B-C50C-407E-A947-70E740481C1C}">
+                          <a14:useLocalDpi xmlns:a14="http://schemas.microsoft.com/office/drawing/2010/main" val="0"/>
+                        </a:ext>
+                      </a:extLst>
+                    </a:blip>
                     <a:stretch>
                       <a:fillRect/>
                     </a:stretch>
@@ -148,7 +188,7 @@
                   <pic:spPr>
                     <a:xfrm>
                       <a:off x="0" y="0"/>
-                      <a:ext cx="6120000" cy="3442500"/>
+                      <a:ext cx="6132830" cy="2256155"/>
                     </a:xfrm>
                     <a:prstGeom prst="rect">
                       <a:avLst/>
@@ -157,118 +197,14 @@
                 </pic:pic>
               </a:graphicData>
             </a:graphic>
-          </wp:inline>
+            <wp14:sizeRelH relativeFrom="margin">
+              <wp14:pctWidth>0</wp14:pctWidth>
+            </wp14:sizeRelH>
+            <wp14:sizeRelV relativeFrom="margin">
+              <wp14:pctHeight>0</wp14:pctHeight>
+            </wp14:sizeRelV>
+          </wp:anchor>
         </w:drawing>
-      </w:r>
-    </w:p>
-    <w:p>
-      <w:pPr>
-        <w:spacing w:after="120"/>
-        <w:jc w:val="center"/>
-      </w:pPr>
-      <w:r>
-        <w:rPr>
-          <w:rFonts w:cs="Segoe UI"/>
-          <w:i/>
-          <w:iCs/>
-          <w:sz w:val="16"/>
-          <w:szCs w:val="16"/>
-          <w:lang w:val="pt-PT"/>
-        </w:rPr>
-        <w:t xml:space="preserve">Visão geral do PVP</w:t>
-      </w:r>
-    </w:p>
-    <w:p>
-      <w:pPr>
-        <w:spacing w:after="60"/>
-        <w:ind w:left="720"/>
-        <w:jc w:val="both"/>
-        <w:rPr>
-          <w:sz w:val="20"/>
-          <w:lang w:val="pt-PT"/>
-        </w:rPr>
-      </w:pPr>
-      <w:r>
-        <w:rPr>
-          <w:rFonts w:cs="Segoe UI"/>
-          <w:b/>
-          <w:bCs/>
-          <w:sz w:val="20"/>
-          <w:szCs w:val="20"/>
-          <w:lang w:val="pt-PT"/>
-        </w:rPr>
-        <w:t xml:space="preserve">O que mostra: </w:t>
-      </w:r>
-      <w:r>
-        <w:rPr>
-          <w:rFonts w:cs="Segoe UI"/>
-          <w:sz w:val="20"/>
-          <w:szCs w:val="20"/>
-          <w:lang w:val="pt-PT"/>
-        </w:rPr>
-        <w:t xml:space="preserve">o estado do plano de produção do período em análise. À esquerda, um cartão por Centro de Custo (C.C.); à direita, o material em risco de falha, a MOD planeada e a previsão de trabalho extra; no topo, os indicadores gerais.</w:t>
-      </w:r>
-    </w:p>
-    <w:p>
-      <w:pPr>
-        <w:spacing w:after="60"/>
-        <w:ind w:left="720"/>
-        <w:jc w:val="both"/>
-        <w:rPr>
-          <w:sz w:val="20"/>
-          <w:lang w:val="pt-PT"/>
-        </w:rPr>
-      </w:pPr>
-      <w:r>
-        <w:rPr>
-          <w:rFonts w:cs="Segoe UI"/>
-          <w:b/>
-          <w:bCs/>
-          <w:sz w:val="20"/>
-          <w:szCs w:val="20"/>
-          <w:lang w:val="pt-PT"/>
-        </w:rPr>
-        <w:t xml:space="preserve">Atualização: </w:t>
-      </w:r>
-      <w:r>
-        <w:rPr>
-          <w:rFonts w:cs="Segoe UI"/>
-          <w:sz w:val="20"/>
-          <w:szCs w:val="20"/>
-          <w:lang w:val="pt-PT"/>
-        </w:rPr>
-        <w:t xml:space="preserve">a página volta a ler os dados sozinha de 30 em 30 minutos. Para ver os dados mais recentes de imediato, carregar em «Atualizar Dados».</w:t>
-      </w:r>
-    </w:p>
-    <w:p>
-      <w:pPr>
-        <w:spacing w:after="60"/>
-        <w:ind w:left="720"/>
-        <w:jc w:val="both"/>
-        <w:rPr>
-          <w:sz w:val="20"/>
-          <w:lang w:val="pt-PT"/>
-        </w:rPr>
-      </w:pPr>
-      <w:r>
-        <w:rPr>
-          <w:rFonts w:cs="Segoe UI"/>
-          <w:b/>
-          <w:bCs/>
-          <w:sz w:val="20"/>
-          <w:szCs w:val="20"/>
-          <w:lang w:val="pt-PT"/>
-        </w:rPr>
-        <w:t xml:space="preserve">Período: </w:t>
-      </w:r>
-      <w:r>
-        <w:rPr>
-          <w:rFonts w:cs="Segoe UI"/>
-          <w:sz w:val="20"/>
-          <w:szCs w:val="20"/>
-          <w:lang w:val="pt-PT"/>
-        </w:rPr>
-        <w:t xml:space="preserve">por defeito é a semana atual, de segunda a domingo. Pode ser alterado nas datas do cabeçalho («Período … até …»).</w:t>
       </w:r>
     </w:p>
     <w:p>
@@ -278,8 +214,8 @@
           <w:ilvl w:val="0"/>
           <w:numId w:val="27"/>
         </w:numPr>
-        <w:spacing w:before="240"/>
         <w:rPr>
+          <w:rFonts w:cs="Segoe UI"/>
           <w:sz w:val="20"/>
           <w:lang w:val="pt-PT"/>
         </w:rPr>
@@ -288,28 +224,61 @@
         <w:rPr>
           <w:rFonts w:cs="Segoe UI"/>
           <w:sz w:val="20"/>
-          <w:szCs w:val="20"/>
           <w:lang w:val="pt-PT"/>
         </w:rPr>
-        <w:t xml:space="preserve">Selecionar a área que pretende analisar.</w:t>
+        <w:t>Selecionar a área que pretende analisar</w:t>
       </w:r>
     </w:p>
     <w:p>
       <w:pPr>
-        <w:keepNext/>
-        <w:spacing w:before="120" w:after="60"/>
-        <w:jc w:val="center"/>
+        <w:rPr>
+          <w:rFonts w:cs="Segoe UI"/>
+          <w:b/>
+          <w:bCs/>
+          <w:sz w:val="18"/>
+          <w:szCs w:val="22"/>
+          <w:lang w:val="pt-PT"/>
+        </w:rPr>
+      </w:pPr>
+    </w:p>
+    <w:p>
+      <w:pPr>
+        <w:rPr>
+          <w:rFonts w:cs="Segoe UI"/>
+          <w:sz w:val="18"/>
+          <w:szCs w:val="22"/>
+          <w:lang w:val="pt-PT"/>
+        </w:rPr>
       </w:pPr>
       <w:r>
         <w:rPr>
+          <w:rFonts w:cs="Segoe UI"/>
           <w:noProof/>
+          <w:sz w:val="18"/>
+          <w:szCs w:val="22"/>
           <w:lang w:val="pt-PT"/>
         </w:rPr>
         <w:drawing>
-          <wp:inline distT="0" distB="0" distL="0" distR="0">
-            <wp:extent cx="1980000" cy="748000"/>
+          <wp:anchor distT="0" distB="0" distL="114300" distR="114300" simplePos="0" relativeHeight="251935744" behindDoc="1" locked="0" layoutInCell="1" allowOverlap="1" wp14:anchorId="354B3908" wp14:editId="4185DD75">
+            <wp:simplePos x="0" y="0"/>
+            <wp:positionH relativeFrom="margin">
+              <wp:align>center</wp:align>
+            </wp:positionH>
+            <wp:positionV relativeFrom="paragraph">
+              <wp:posOffset>29845</wp:posOffset>
+            </wp:positionV>
+            <wp:extent cx="2895851" cy="1028789"/>
             <wp:effectExtent l="0" t="0" r="0" b="0"/>
-            <wp:docPr id="9001" name="Imagem 9001"/>
+            <wp:wrapTight wrapText="bothSides">
+              <wp:wrapPolygon edited="0">
+                <wp:start x="0" y="0"/>
+                <wp:lineTo x="0" y="21200"/>
+                <wp:lineTo x="21458" y="21200"/>
+                <wp:lineTo x="21458" y="0"/>
+                <wp:lineTo x="0" y="0"/>
+              </wp:wrapPolygon>
+            </wp:wrapTight>
+            <wp:docPr id="1141267658" name="Picture 1"/>
             <wp:cNvGraphicFramePr>
               <a:graphicFrameLocks xmlns:a="http://schemas.openxmlformats.org/drawingml/2006/main" noChangeAspect="1"/>
             </wp:cNvGraphicFramePr>
@@ -317,11 +286,17 @@
               <a:graphicData uri="http://schemas.openxmlformats.org/drawingml/2006/picture">
                 <pic:pic xmlns:pic="http://schemas.openxmlformats.org/drawingml/2006/picture">
                   <pic:nvPicPr>
-                    <pic:cNvPr id="9001" name="pvp_02_area.png"/>
+                    <pic:cNvPr id="1141267658" name=""/>
                     <pic:cNvPicPr/>
                   </pic:nvPicPr>
                   <pic:blipFill>
-                    <a:blip r:embed="rId501"/>
+                    <a:blip r:embed="rId16">
+                      <a:extLst>
+                        <a:ext uri="{28A0092B-C50C-407E-A947-70E740481C1C}">
+                          <a14:useLocalDpi xmlns:a14="http://schemas.microsoft.com/office/drawing/2010/main" val="0"/>
+                        </a:ext>
+                      </a:extLst>
+                    </a:blip>
                     <a:stretch>
                       <a:fillRect/>
                     </a:stretch>
@@ -329,7 +304,7 @@
                   <pic:spPr>
                     <a:xfrm>
                       <a:off x="0" y="0"/>
-                      <a:ext cx="1980000" cy="748000"/>
+                      <a:ext cx="2895851" cy="1028789"/>
                     </a:xfrm>
                     <a:prstGeom prst="rect">
                       <a:avLst/>
@@ -338,16 +313,119 @@
                 </pic:pic>
               </a:graphicData>
             </a:graphic>
-          </wp:inline>
+          </wp:anchor>
         </w:drawing>
       </w:r>
     </w:p>
     <w:p>
       <w:pPr>
-        <w:spacing w:after="60"/>
-        <w:ind w:left="720"/>
-        <w:jc w:val="both"/>
         <w:rPr>
+          <w:rFonts w:cs="Segoe UI"/>
+          <w:sz w:val="18"/>
+          <w:szCs w:val="22"/>
+          <w:lang w:val="pt-PT"/>
+        </w:rPr>
+      </w:pPr>
+    </w:p>
+    <w:p>
+      <w:pPr>
+        <w:rPr>
+          <w:rFonts w:cs="Segoe UI"/>
+          <w:sz w:val="18"/>
+          <w:szCs w:val="22"/>
+          <w:lang w:val="pt-PT"/>
+        </w:rPr>
+      </w:pPr>
+    </w:p>
+    <w:p>
+      <w:pPr>
+        <w:rPr>
+          <w:rFonts w:cs="Segoe UI"/>
+          <w:sz w:val="18"/>
+          <w:szCs w:val="22"/>
+          <w:lang w:val="pt-PT"/>
+        </w:rPr>
+      </w:pPr>
+    </w:p>
+    <w:p>
+      <w:pPr>
+        <w:rPr>
+          <w:rFonts w:cs="Segoe UI"/>
+          <w:sz w:val="18"/>
+          <w:szCs w:val="22"/>
+          <w:lang w:val="pt-PT"/>
+        </w:rPr>
+      </w:pPr>
+    </w:p>
+    <w:p>
+      <w:pPr>
+        <w:rPr>
+          <w:rFonts w:cs="Segoe UI"/>
+          <w:sz w:val="18"/>
+          <w:szCs w:val="22"/>
+          <w:lang w:val="pt-PT"/>
+        </w:rPr>
+      </w:pPr>
+    </w:p>
+    <w:p>
+      <w:pPr>
+        <w:rPr>
+          <w:rFonts w:cs="Segoe UI"/>
+          <w:sz w:val="18"/>
+          <w:szCs w:val="22"/>
+          <w:lang w:val="pt-PT"/>
+        </w:rPr>
+      </w:pPr>
+    </w:p>
+    <w:p>
+      <w:pPr>
+        <w:rPr>
+          <w:rFonts w:cs="Segoe UI"/>
+          <w:sz w:val="18"/>
+          <w:szCs w:val="22"/>
+          <w:lang w:val="pt-PT"/>
+        </w:rPr>
+      </w:pPr>
+    </w:p>
+    <w:p>
+      <w:pPr>
+        <w:pStyle w:val="ListParagraph"/>
+        <w:numPr>
+          <w:ilvl w:val="0"/>
+          <w:numId w:val="27"/>
+        </w:numPr>
+        <w:rPr>
+          <w:rFonts w:cs="Segoe UI"/>
+          <w:sz w:val="20"/>
+          <w:lang w:val="pt-PT"/>
+        </w:rPr>
+      </w:pPr>
+      <w:r>
+        <w:rPr>
+          <w:rFonts w:cs="Segoe UI"/>
+          <w:sz w:val="20"/>
+          <w:lang w:val="pt-PT"/>
+        </w:rPr>
+        <w:t>Verificar quando foi a última atualização.</w:t>
+      </w:r>
+    </w:p>
+    <w:p>
+      <w:pPr>
+        <w:rPr>
+          <w:rFonts w:cs="Segoe UI"/>
+          <w:b/>
+          <w:bCs/>
+          <w:sz w:val="20"/>
+          <w:lang w:val="pt-PT"/>
+        </w:rPr>
+      </w:pPr>
+    </w:p>
+    <w:p>
+      <w:pPr>
+        <w:rPr>
+          <w:rFonts w:cs="Segoe UI"/>
+          <w:b/>
+          <w:bCs/>
           <w:sz w:val="20"/>
           <w:lang w:val="pt-PT"/>
         </w:rPr>
@@ -357,101 +435,31 @@
           <w:rFonts w:cs="Segoe UI"/>
           <w:b/>
           <w:bCs/>
-          <w:sz w:val="20"/>
-          <w:szCs w:val="20"/>
-          <w:lang w:val="pt-PT"/>
-        </w:rPr>
-        <w:t xml:space="preserve">Como funciona: </w:t>
-      </w:r>
-      <w:r>
-        <w:rPr>
-          <w:rFonts w:cs="Segoe UI"/>
-          <w:sz w:val="20"/>
-          <w:szCs w:val="20"/>
-          <w:lang w:val="pt-PT"/>
-        </w:rPr>
-        <w:t xml:space="preserve">os botões </w:t>
-      </w:r>
-      <w:r>
-        <w:rPr>
-          <w:rFonts w:cs="Segoe UI"/>
-          <w:b/>
-          <w:bCs/>
-          <w:sz w:val="20"/>
-          <w:szCs w:val="20"/>
-          <w:lang w:val="pt-PT"/>
-        </w:rPr>
-        <w:t xml:space="preserve">OPA</w:t>
-      </w:r>
-      <w:r>
-        <w:rPr>
-          <w:rFonts w:cs="Segoe UI"/>
-          <w:sz w:val="20"/>
-          <w:szCs w:val="20"/>
-          <w:lang w:val="pt-PT"/>
-        </w:rPr>
-        <w:t xml:space="preserve"> e </w:t>
-      </w:r>
-      <w:r>
-        <w:rPr>
-          <w:rFonts w:cs="Segoe UI"/>
-          <w:b/>
-          <w:bCs/>
-          <w:sz w:val="20"/>
-          <w:szCs w:val="20"/>
-          <w:lang w:val="pt-PT"/>
-        </w:rPr>
-        <w:t xml:space="preserve">OPT</w:t>
-      </w:r>
-      <w:r>
-        <w:rPr>
-          <w:rFonts w:cs="Segoe UI"/>
-          <w:sz w:val="20"/>
-          <w:szCs w:val="20"/>
-          <w:lang w:val="pt-PT"/>
-        </w:rPr>
-        <w:t xml:space="preserve"> filtram todo o ecrã pela área: indicadores, C.C., material em risco, MOD e trabalho extra. Carregar outra vez no botão ativo volta a mostrar as duas áreas.</w:t>
-      </w:r>
-    </w:p>
-    <w:p>
-      <w:pPr>
-        <w:pStyle w:val="ListParagraph"/>
-        <w:numPr>
-          <w:ilvl w:val="0"/>
-          <w:numId w:val="27"/>
-        </w:numPr>
-        <w:spacing w:before="240"/>
-        <w:rPr>
+          <w:noProof/>
           <w:sz w:val="20"/>
           <w:lang w:val="pt-PT"/>
         </w:rPr>
-      </w:pPr>
-      <w:r>
-        <w:rPr>
-          <w:rFonts w:cs="Segoe UI"/>
-          <w:sz w:val="20"/>
-          <w:szCs w:val="20"/>
-          <w:lang w:val="pt-PT"/>
-        </w:rPr>
-        <w:t xml:space="preserve">Verificar quando foi a última atualização.</w:t>
-      </w:r>
-    </w:p>
-    <w:p>
-      <w:pPr>
-        <w:keepNext/>
-        <w:spacing w:before="120" w:after="60"/>
-        <w:jc w:val="center"/>
-      </w:pPr>
-      <w:r>
-        <w:rPr>
-          <w:noProof/>
-          <w:lang w:val="pt-PT"/>
-        </w:rPr>
         <w:drawing>
-          <wp:inline distT="0" distB="0" distL="0" distR="0">
-            <wp:extent cx="6120000" cy="318750"/>
-            <wp:effectExtent l="0" t="0" r="0" b="0"/>
-            <wp:docPr id="9002" name="Imagem 9002"/>
+          <wp:anchor distT="0" distB="0" distL="114300" distR="114300" simplePos="0" relativeHeight="251929600" behindDoc="1" locked="0" layoutInCell="1" allowOverlap="1" wp14:anchorId="40D1F3FE" wp14:editId="3FE3F81C">
+            <wp:simplePos x="0" y="0"/>
+            <wp:positionH relativeFrom="margin">
+              <wp:align>center</wp:align>
+            </wp:positionH>
+            <wp:positionV relativeFrom="paragraph">
+              <wp:posOffset>91715</wp:posOffset>
+            </wp:positionV>
+            <wp:extent cx="1592718" cy="426757"/>
+            <wp:effectExtent l="0" t="0" r="7620" b="0"/>
+            <wp:wrapTight wrapText="bothSides">
+              <wp:wrapPolygon edited="0">
+                <wp:start x="0" y="0"/>
+                <wp:lineTo x="0" y="20250"/>
+                <wp:lineTo x="21445" y="20250"/>
+                <wp:lineTo x="21445" y="0"/>
+                <wp:lineTo x="0" y="0"/>
+              </wp:wrapPolygon>
+            </wp:wrapTight>
+            <wp:docPr id="256605843" name="Picture 1"/>
             <wp:cNvGraphicFramePr>
               <a:graphicFrameLocks xmlns:a="http://schemas.openxmlformats.org/drawingml/2006/main" noChangeAspect="1"/>
             </wp:cNvGraphicFramePr>
@@ -459,11 +467,17 @@
               <a:graphicData uri="http://schemas.openxmlformats.org/drawingml/2006/picture">
                 <pic:pic xmlns:pic="http://schemas.openxmlformats.org/drawingml/2006/picture">
                   <pic:nvPicPr>
-                    <pic:cNvPr id="9002" name="pvp_03_cabecalho.png"/>
+                    <pic:cNvPr id="256605843" name=""/>
                     <pic:cNvPicPr/>
                   </pic:nvPicPr>
                   <pic:blipFill>
-                    <a:blip r:embed="rId502"/>
+                    <a:blip r:embed="rId17">
+                      <a:extLst>
+                        <a:ext uri="{28A0092B-C50C-407E-A947-70E740481C1C}">
+                          <a14:useLocalDpi xmlns:a14="http://schemas.microsoft.com/office/drawing/2010/main" val="0"/>
+                        </a:ext>
+                      </a:extLst>
+                    </a:blip>
                     <a:stretch>
                       <a:fillRect/>
                     </a:stretch>
@@ -471,7 +485,7 @@
                   <pic:spPr>
                     <a:xfrm>
                       <a:off x="0" y="0"/>
-                      <a:ext cx="6120000" cy="318750"/>
+                      <a:ext cx="1592718" cy="426757"/>
                     </a:xfrm>
                     <a:prstGeom prst="rect">
                       <a:avLst/>
@@ -480,15 +494,78 @@
                 </pic:pic>
               </a:graphicData>
             </a:graphic>
-          </wp:inline>
+          </wp:anchor>
         </w:drawing>
       </w:r>
     </w:p>
     <w:p>
       <w:pPr>
-        <w:spacing w:after="60"/>
-        <w:ind w:left="720"/>
-        <w:jc w:val="both"/>
+        <w:rPr>
+          <w:rFonts w:cs="Segoe UI"/>
+          <w:b/>
+          <w:bCs/>
+          <w:sz w:val="18"/>
+          <w:szCs w:val="22"/>
+          <w:lang w:val="pt-PT"/>
+        </w:rPr>
+      </w:pPr>
+    </w:p>
+    <w:p>
+      <w:pPr>
+        <w:rPr>
+          <w:rFonts w:cs="Segoe UI"/>
+          <w:b/>
+          <w:bCs/>
+          <w:sz w:val="18"/>
+          <w:szCs w:val="22"/>
+          <w:lang w:val="pt-PT"/>
+        </w:rPr>
+      </w:pPr>
+    </w:p>
+    <w:p>
+      <w:pPr>
+        <w:rPr>
+          <w:rFonts w:cs="Segoe UI"/>
+          <w:b/>
+          <w:bCs/>
+          <w:sz w:val="18"/>
+          <w:szCs w:val="22"/>
+          <w:lang w:val="pt-PT"/>
+        </w:rPr>
+      </w:pPr>
+    </w:p>
+    <w:p>
+      <w:pPr>
+        <w:rPr>
+          <w:rFonts w:cs="Segoe UI"/>
+          <w:b/>
+          <w:bCs/>
+          <w:sz w:val="18"/>
+          <w:szCs w:val="22"/>
+          <w:lang w:val="pt-PT"/>
+        </w:rPr>
+      </w:pPr>
+    </w:p>
+    <w:p>
+      <w:pPr>
+        <w:rPr>
+          <w:rFonts w:cs="Segoe UI"/>
+          <w:b/>
+          <w:bCs/>
+          <w:sz w:val="18"/>
+          <w:szCs w:val="22"/>
+          <w:lang w:val="pt-PT"/>
+        </w:rPr>
+      </w:pPr>
+    </w:p>
+    <w:bookmarkEnd w:id="0"/>
+    <w:p>
+      <w:pPr>
+        <w:pStyle w:val="ListParagraph"/>
+        <w:numPr>
+          <w:ilvl w:val="0"/>
+          <w:numId w:val="27"/>
+        </w:numPr>
         <w:rPr>
           <w:sz w:val="20"/>
           <w:lang w:val="pt-PT"/>
@@ -500,141 +577,40 @@
           <w:b/>
           <w:bCs/>
           <w:sz w:val="20"/>
-          <w:szCs w:val="20"/>
           <w:lang w:val="pt-PT"/>
         </w:rPr>
-        <w:t xml:space="preserve">Atualizado a: </w:t>
+        <w:t>Verificar indicadores</w:t>
       </w:r>
       <w:r>
         <w:rPr>
           <w:rFonts w:cs="Segoe UI"/>
           <w:sz w:val="20"/>
+          <w:lang w:val="pt-PT"/>
+        </w:rPr>
+        <w:t xml:space="preserve"> de sustentabilidade.</w:t>
+      </w:r>
+    </w:p>
+    <w:p>
+      <w:pPr>
+        <w:ind w:left="720"/>
+        <w:rPr>
+          <w:sz w:val="20"/>
           <w:szCs w:val="20"/>
           <w:lang w:val="pt-PT"/>
         </w:rPr>
-        <w:t xml:space="preserve">no canto superior direito aparece a hora da última leitura dos dados. Se os dados estiverem desatualizados há muito tempo, a indicação muda de cor; nesse caso, carregar em «Atualizar Dados».</w:t>
-      </w:r>
-    </w:p>
-    <w:p>
-      <w:pPr>
-        <w:spacing w:after="60"/>
-        <w:ind w:left="720"/>
-        <w:jc w:val="both"/>
-        <w:rPr>
-          <w:sz w:val="20"/>
-          <w:lang w:val="pt-PT"/>
-        </w:rPr>
       </w:pPr>
       <w:r>
         <w:rPr>
-          <w:rFonts w:cs="Segoe UI"/>
           <w:b/>
           <w:bCs/>
           <w:sz w:val="20"/>
           <w:szCs w:val="20"/>
           <w:lang w:val="pt-PT"/>
         </w:rPr>
-        <w:t xml:space="preserve">Bolinha «Live Status»: </w:t>
+        <w:t>Nota:</w:t>
       </w:r>
       <w:r>
         <w:rPr>
-          <w:rFonts w:cs="Segoe UI"/>
-          <w:sz w:val="20"/>
-          <w:szCs w:val="20"/>
-          <w:lang w:val="pt-PT"/>
-        </w:rPr>
-        <w:t xml:space="preserve">antes do título. Mostra, de relance, se o conjunto dos C.C. está em avanço (verde) ou em atraso (vermelho).</w:t>
-      </w:r>
-    </w:p>
-    <w:p>
-      <w:pPr>
-        <w:spacing w:after="60"/>
-        <w:ind w:left="720"/>
-        <w:jc w:val="both"/>
-        <w:rPr>
-          <w:sz w:val="20"/>
-          <w:lang w:val="pt-PT"/>
-        </w:rPr>
-      </w:pPr>
-      <w:r>
-        <w:rPr>
-          <w:rFonts w:cs="Segoe UI"/>
-          <w:b/>
-          <w:bCs/>
-          <w:sz w:val="20"/>
-          <w:szCs w:val="20"/>
-          <w:lang w:val="pt-PT"/>
-        </w:rPr>
-        <w:t xml:space="preserve">Backlog e Ensaios: </w:t>
-      </w:r>
-      <w:r>
-        <w:rPr>
-          <w:rFonts w:cs="Segoe UI"/>
-          <w:sz w:val="20"/>
-          <w:szCs w:val="20"/>
-          <w:lang w:val="pt-PT"/>
-        </w:rPr>
-        <w:t xml:space="preserve">«Backlog» é o número de itens que ficaram por produzir de dias anteriores ao período; «Ensaios» é o número de ensaios de ferramenta incluídos. Clicar em cada um mostra a lista.</w:t>
-      </w:r>
-    </w:p>
-    <w:p>
-      <w:pPr>
-        <w:pStyle w:val="ListParagraph"/>
-        <w:numPr>
-          <w:ilvl w:val="0"/>
-          <w:numId w:val="27"/>
-        </w:numPr>
-        <w:spacing w:before="240"/>
-        <w:rPr>
-          <w:sz w:val="20"/>
-          <w:lang w:val="pt-PT"/>
-        </w:rPr>
-      </w:pPr>
-      <w:r>
-        <w:rPr>
-          <w:rFonts w:cs="Segoe UI"/>
-          <w:b/>
-          <w:bCs/>
-          <w:sz w:val="20"/>
-          <w:szCs w:val="20"/>
-          <w:lang w:val="pt-PT"/>
-        </w:rPr>
-        <w:t xml:space="preserve">Verificar indicadores</w:t>
-      </w:r>
-      <w:r>
-        <w:rPr>
-          <w:rFonts w:cs="Segoe UI"/>
-          <w:sz w:val="20"/>
-          <w:szCs w:val="20"/>
-          <w:lang w:val="pt-PT"/>
-        </w:rPr>
-        <w:t xml:space="preserve"> de sustentabilidade.</w:t>
-      </w:r>
-    </w:p>
-    <w:p>
-      <w:pPr>
-        <w:spacing w:after="60"/>
-        <w:ind w:left="720"/>
-        <w:jc w:val="both"/>
-        <w:rPr>
-          <w:sz w:val="20"/>
-          <w:lang w:val="pt-PT"/>
-        </w:rPr>
-      </w:pPr>
-      <w:r>
-        <w:rPr>
-          <w:rFonts w:cs="Segoe UI"/>
-          <w:b/>
-          <w:bCs/>
-          <w:sz w:val="20"/>
-          <w:szCs w:val="20"/>
-          <w:lang w:val="pt-PT"/>
-        </w:rPr>
-        <w:t xml:space="preserve">Nota:</w:t>
-      </w:r>
-      <w:r>
-        <w:rPr>
-          <w:rFonts w:cs="Segoe UI"/>
           <w:sz w:val="20"/>
           <w:szCs w:val="20"/>
           <w:lang w:val="pt-PT"/>
@@ -644,20 +620,49 @@
     </w:p>
     <w:p>
       <w:pPr>
-        <w:keepNext/>
-        <w:spacing w:before="120" w:after="60"/>
-        <w:jc w:val="center"/>
+        <w:rPr>
+          <w:sz w:val="20"/>
+          <w:szCs w:val="22"/>
+          <w:lang w:val="pt-PT"/>
+        </w:rPr>
+      </w:pPr>
+    </w:p>
+    <w:p>
+      <w:pPr>
+        <w:rPr>
+          <w:sz w:val="20"/>
+          <w:szCs w:val="22"/>
+          <w:lang w:val="pt-PT"/>
+        </w:rPr>
       </w:pPr>
       <w:r>
         <w:rPr>
           <w:noProof/>
+          <w:sz w:val="20"/>
+          <w:szCs w:val="22"/>
           <w:lang w:val="pt-PT"/>
         </w:rPr>
         <w:drawing>
-          <wp:inline distT="0" distB="0" distL="0" distR="0">
-            <wp:extent cx="6120000" cy="456977"/>
-            <wp:effectExtent l="0" t="0" r="0" b="0"/>
-            <wp:docPr id="9003" name="Imagem 9003"/>
+          <wp:anchor distT="0" distB="0" distL="114300" distR="114300" simplePos="0" relativeHeight="251930624" behindDoc="1" locked="0" layoutInCell="1" allowOverlap="1" wp14:anchorId="2F225B5B" wp14:editId="21360D06">
+            <wp:simplePos x="0" y="0"/>
+            <wp:positionH relativeFrom="margin">
+              <wp:align>center</wp:align>
+            </wp:positionH>
+            <wp:positionV relativeFrom="paragraph">
+              <wp:posOffset>153035</wp:posOffset>
+            </wp:positionV>
+            <wp:extent cx="5745978" cy="723963"/>
+            <wp:effectExtent l="0" t="0" r="7620" b="0"/>
+            <wp:wrapTight wrapText="bothSides">
+              <wp:wrapPolygon edited="0">
+                <wp:start x="0" y="0"/>
+                <wp:lineTo x="0" y="21032"/>
+                <wp:lineTo x="21557" y="21032"/>
+                <wp:lineTo x="21557" y="0"/>
+                <wp:lineTo x="0" y="0"/>
+              </wp:wrapPolygon>
+            </wp:wrapTight>
+            <wp:docPr id="543368834" name="Picture 1"/>
             <wp:cNvGraphicFramePr>
               <a:graphicFrameLocks xmlns:a="http://schemas.openxmlformats.org/drawingml/2006/main" noChangeAspect="1"/>
             </wp:cNvGraphicFramePr>
@@ -665,11 +670,17 @@
               <a:graphicData uri="http://schemas.openxmlformats.org/drawingml/2006/picture">
                 <pic:pic xmlns:pic="http://schemas.openxmlformats.org/drawingml/2006/picture">
                   <pic:nvPicPr>
-                    <pic:cNvPr id="9003" name="pvp_04_indicadores.png"/>
+                    <pic:cNvPr id="543368834" name=""/>
                     <pic:cNvPicPr/>
                   </pic:nvPicPr>
                   <pic:blipFill>
-                    <a:blip r:embed="rId503"/>
+                    <a:blip r:embed="rId18">
+                      <a:extLst>
+                        <a:ext uri="{28A0092B-C50C-407E-A947-70E740481C1C}">
+                          <a14:useLocalDpi xmlns:a14="http://schemas.microsoft.com/office/drawing/2010/main" val="0"/>
+                        </a:ext>
+                      </a:extLst>
+                    </a:blip>
                     <a:stretch>
                       <a:fillRect/>
                     </a:stretch>
@@ -677,7 +688,7 @@
                   <pic:spPr>
                     <a:xfrm>
                       <a:off x="0" y="0"/>
-                      <a:ext cx="6120000" cy="456977"/>
+                      <a:ext cx="5745978" cy="723963"/>
                     </a:xfrm>
                     <a:prstGeom prst="rect">
                       <a:avLst/>
@@ -686,57 +697,101 @@
                 </pic:pic>
               </a:graphicData>
             </a:graphic>
-          </wp:inline>
+          </wp:anchor>
         </w:drawing>
       </w:r>
     </w:p>
     <w:p>
       <w:pPr>
-        <w:spacing w:after="120"/>
-        <w:jc w:val="center"/>
-      </w:pPr>
-      <w:r>
         <w:rPr>
-          <w:rFonts w:cs="Segoe UI"/>
-          <w:i/>
-          <w:iCs/>
-          <w:sz w:val="16"/>
-          <w:szCs w:val="16"/>
+          <w:sz w:val="20"/>
+          <w:szCs w:val="22"/>
           <w:lang w:val="pt-PT"/>
         </w:rPr>
-        <w:t xml:space="preserve">Indicadores gerais (clicar num cartão abre o detalhe)</w:t>
-      </w:r>
+      </w:pPr>
     </w:p>
     <w:p>
       <w:pPr>
-        <w:keepNext/>
-        <w:spacing w:before="200" w:after="60"/>
-        <w:ind w:left="720"/>
         <w:rPr>
           <w:sz w:val="20"/>
+          <w:szCs w:val="22"/>
           <w:lang w:val="pt-PT"/>
         </w:rPr>
       </w:pPr>
-      <w:r>
+    </w:p>
+    <w:p>
+      <w:pPr>
         <w:rPr>
-          <w:rFonts w:cs="Segoe UI"/>
-          <w:b/>
-          <w:bCs/>
-          <w:u w:val="single"/>
           <w:sz w:val="20"/>
-          <w:szCs w:val="20"/>
+          <w:szCs w:val="22"/>
           <w:lang w:val="pt-PT"/>
         </w:rPr>
-        <w:t xml:space="preserve">Total em atraso / Total avanço</w:t>
-      </w:r>
+      </w:pPr>
     </w:p>
     <w:p>
       <w:pPr>
-        <w:spacing w:after="60"/>
-        <w:ind w:left="720"/>
-        <w:jc w:val="both"/>
         <w:rPr>
           <w:sz w:val="20"/>
+          <w:szCs w:val="22"/>
+          <w:lang w:val="pt-PT"/>
+        </w:rPr>
+      </w:pPr>
+    </w:p>
+    <w:p>
+      <w:pPr>
+        <w:rPr>
+          <w:sz w:val="20"/>
+          <w:szCs w:val="22"/>
+          <w:lang w:val="pt-PT"/>
+        </w:rPr>
+      </w:pPr>
+    </w:p>
+    <w:p>
+      <w:pPr>
+        <w:rPr>
+          <w:sz w:val="20"/>
+          <w:szCs w:val="22"/>
+          <w:lang w:val="pt-PT"/>
+        </w:rPr>
+      </w:pPr>
+    </w:p>
+    <w:p>
+      <w:pPr>
+        <w:rPr>
+          <w:sz w:val="20"/>
+          <w:szCs w:val="22"/>
+          <w:lang w:val="pt-PT"/>
+        </w:rPr>
+      </w:pPr>
+    </w:p>
+    <w:p>
+      <w:pPr>
+        <w:rPr>
+          <w:sz w:val="20"/>
+          <w:szCs w:val="22"/>
+          <w:lang w:val="pt-PT"/>
+        </w:rPr>
+      </w:pPr>
+    </w:p>
+    <w:p>
+      <w:pPr>
+        <w:rPr>
+          <w:sz w:val="20"/>
+          <w:szCs w:val="22"/>
+          <w:lang w:val="pt-PT"/>
+        </w:rPr>
+      </w:pPr>
+    </w:p>
+    <w:p>
+      <w:pPr>
+        <w:pStyle w:val="ListParagraph"/>
+        <w:numPr>
+          <w:ilvl w:val="0"/>
+          <w:numId w:val="27"/>
+        </w:numPr>
+        <w:rPr>
+          <w:sz w:val="20"/>
+          <w:szCs w:val="22"/>
           <w:lang w:val="pt-PT"/>
         </w:rPr>
       </w:pPr>
@@ -746,27 +801,24 @@
           <w:b/>
           <w:bCs/>
           <w:sz w:val="20"/>
-          <w:szCs w:val="20"/>
           <w:lang w:val="pt-PT"/>
         </w:rPr>
-        <w:t xml:space="preserve">O que mostra: </w:t>
+        <w:t>Verificar o status</w:t>
       </w:r>
       <w:r>
         <w:rPr>
           <w:rFonts w:cs="Segoe UI"/>
           <w:sz w:val="20"/>
-          <w:szCs w:val="20"/>
           <w:lang w:val="pt-PT"/>
         </w:rPr>
-        <w:t xml:space="preserve">o saldo, em horas, de todos os C.C. da área.</w:t>
+        <w:t xml:space="preserve"> dos Centros de Custo.</w:t>
       </w:r>
     </w:p>
     <w:p>
       <w:pPr>
-        <w:spacing w:after="60"/>
-        <w:ind w:left="720"/>
-        <w:jc w:val="both"/>
+        <w:pStyle w:val="ListParagraph"/>
         <w:rPr>
+          <w:rFonts w:cs="Segoe UI"/>
           <w:sz w:val="20"/>
           <w:lang w:val="pt-PT"/>
         </w:rPr>
@@ -777,606 +829,109 @@
           <w:b/>
           <w:bCs/>
           <w:sz w:val="20"/>
-          <w:szCs w:val="20"/>
           <w:lang w:val="pt-PT"/>
         </w:rPr>
-        <w:t xml:space="preserve">Como se obtém: </w:t>
+        <w:t>Nota:</w:t>
       </w:r>
       <w:r>
         <w:rPr>
           <w:rFonts w:cs="Segoe UI"/>
           <w:sz w:val="20"/>
-          <w:szCs w:val="20"/>
           <w:lang w:val="pt-PT"/>
         </w:rPr>
-        <w:t xml:space="preserve">soma do avanço/atraso de cada C.C. (ver passo 5). O avanço de um C.C. compensa o atraso de outro. O título diz se o saldo é de avanço ou de atraso.</w:t>
+        <w:t xml:space="preserve"> os </w:t>
       </w:r>
-    </w:p>
-    <w:p>
-      <w:pPr>
-        <w:spacing w:after="60"/>
-        <w:ind w:left="720"/>
-        <w:jc w:val="both"/>
-        <w:rPr>
-          <w:sz w:val="20"/>
-          <w:lang w:val="pt-PT"/>
-        </w:rPr>
-      </w:pPr>
-      <w:r>
-        <w:rPr>
-          <w:rFonts w:cs="Segoe UI"/>
-          <w:b/>
-          <w:bCs/>
-          <w:sz w:val="20"/>
-          <w:szCs w:val="20"/>
-          <w:lang w:val="pt-PT"/>
-        </w:rPr>
-        <w:t xml:space="preserve">Como analisar: </w:t>
-      </w:r>
+      <w:proofErr w:type="spellStart"/>
       <w:r>
         <w:rPr>
           <w:rFonts w:cs="Segoe UI"/>
           <w:sz w:val="20"/>
-          <w:szCs w:val="20"/>
           <w:lang w:val="pt-PT"/>
         </w:rPr>
-        <w:t xml:space="preserve">dá a visão geral; para saber onde está o problema, clicar no cartão — abre a lista de tudo o que entra na conta, C.C. a C.C.</w:t>
+        <w:t>CC’s</w:t>
       </w:r>
-    </w:p>
-    <w:p>
-      <w:pPr>
-        <w:keepNext/>
-        <w:spacing w:before="200" w:after="60"/>
-        <w:ind w:left="720"/>
-        <w:rPr>
-          <w:sz w:val="20"/>
-          <w:lang w:val="pt-PT"/>
-        </w:rPr>
-      </w:pPr>
-      <w:r>
-        <w:rPr>
-          <w:rFonts w:cs="Segoe UI"/>
-          <w:b/>
-          <w:bCs/>
-          <w:u w:val="single"/>
-          <w:sz w:val="20"/>
-          <w:szCs w:val="20"/>
-          <w:lang w:val="pt-PT"/>
-        </w:rPr>
-        <w:t xml:space="preserve">% CC em atraso &gt; 8H</w:t>
-      </w:r>
-    </w:p>
-    <w:p>
-      <w:pPr>
-        <w:spacing w:after="60"/>
-        <w:ind w:left="720"/>
-        <w:jc w:val="both"/>
-        <w:rPr>
-          <w:sz w:val="20"/>
-          <w:lang w:val="pt-PT"/>
-        </w:rPr>
-      </w:pPr>
-      <w:r>
-        <w:rPr>
-          <w:rFonts w:cs="Segoe UI"/>
-          <w:b/>
-          <w:bCs/>
-          <w:sz w:val="20"/>
-          <w:szCs w:val="20"/>
-          <w:lang w:val="pt-PT"/>
-        </w:rPr>
-        <w:t xml:space="preserve">O que mostra: </w:t>
-      </w:r>
+      <w:proofErr w:type="spellEnd"/>
       <w:r>
         <w:rPr>
           <w:rFonts w:cs="Segoe UI"/>
           <w:sz w:val="20"/>
-          <w:szCs w:val="20"/>
           <w:lang w:val="pt-PT"/>
         </w:rPr>
-        <w:t xml:space="preserve">que parte dos C.C. da área tem mais de 8 horas de atraso.</w:t>
+        <w:t xml:space="preserve"> devem variar num intervalo de 8H positivas e negativas. </w:t>
       </w:r>
     </w:p>
     <w:p>
       <w:pPr>
-        <w:spacing w:after="60"/>
-        <w:ind w:left="720"/>
-        <w:jc w:val="both"/>
+        <w:pStyle w:val="ListParagraph"/>
         <w:rPr>
           <w:sz w:val="20"/>
+          <w:szCs w:val="22"/>
           <w:lang w:val="pt-PT"/>
         </w:rPr>
       </w:pPr>
-      <w:r>
-        <w:rPr>
-          <w:rFonts w:cs="Segoe UI"/>
-          <w:b/>
-          <w:bCs/>
-          <w:sz w:val="20"/>
-          <w:szCs w:val="20"/>
-          <w:lang w:val="pt-PT"/>
-        </w:rPr>
-        <w:t xml:space="preserve">Como se obtém: </w:t>
-      </w:r>
       <w:r>
         <w:rPr>
           <w:rFonts w:cs="Segoe UI"/>
           <w:sz w:val="20"/>
-          <w:szCs w:val="20"/>
           <w:lang w:val="pt-PT"/>
         </w:rPr>
-        <w:t xml:space="preserve">nº de C.C. com mais de 8h de atraso ÷ nº total de C.C. da área. Por baixo aparece a contagem (ex.: «2 de 8 C.C.» = 25%).</w:t>
+        <w:t>Mais de 8H de atraso pode comprometer as operações seguintes.</w:t>
       </w:r>
     </w:p>
     <w:p>
       <w:pPr>
-        <w:spacing w:after="60"/>
-        <w:ind w:left="720"/>
-        <w:jc w:val="both"/>
+        <w:pStyle w:val="ListParagraph"/>
         <w:rPr>
           <w:sz w:val="20"/>
+          <w:szCs w:val="22"/>
           <w:lang w:val="pt-PT"/>
         </w:rPr>
       </w:pPr>
       <w:r>
         <w:rPr>
-          <w:rFonts w:cs="Segoe UI"/>
-          <w:b/>
-          <w:bCs/>
           <w:sz w:val="20"/>
-          <w:szCs w:val="20"/>
+          <w:szCs w:val="22"/>
           <w:lang w:val="pt-PT"/>
         </w:rPr>
-        <w:t xml:space="preserve">Como analisar: </w:t>
-      </w:r>
-      <w:r>
-        <w:rPr>
-          <w:rFonts w:cs="Segoe UI"/>
-          <w:sz w:val="20"/>
-          <w:szCs w:val="20"/>
-          <w:lang w:val="pt-PT"/>
-        </w:rPr>
-        <w:t xml:space="preserve">quanto mais baixo, melhor. Clicar no cartão mostra quais são esses C.C.</w:t>
+        <w:t>Mais de 8H de avanço pode comprometer os indicadores de sustentabilidade.</w:t>
       </w:r>
     </w:p>
     <w:p>
       <w:pPr>
-        <w:keepNext/>
-        <w:spacing w:before="200" w:after="60"/>
-        <w:ind w:left="720"/>
         <w:rPr>
           <w:sz w:val="20"/>
+          <w:szCs w:val="22"/>
           <w:lang w:val="pt-PT"/>
         </w:rPr>
-      </w:pPr>
-      <w:r>
-        <w:rPr>
-          <w:rFonts w:cs="Segoe UI"/>
-          <w:b/>
-          <w:bCs/>
-          <w:u w:val="single"/>
-          <w:sz w:val="20"/>
-          <w:szCs w:val="20"/>
-          <w:lang w:val="pt-PT"/>
-        </w:rPr>
-        <w:t xml:space="preserve">Qtd. Produzido/Planeado (%)</w:t>
-      </w:r>
-    </w:p>
-    <w:p>
-      <w:pPr>
-        <w:spacing w:after="60"/>
-        <w:ind w:left="720"/>
-        <w:jc w:val="both"/>
-        <w:rPr>
-          <w:sz w:val="20"/>
-          <w:lang w:val="pt-PT"/>
-        </w:rPr>
-      </w:pPr>
-      <w:r>
-        <w:rPr>
-          <w:rFonts w:cs="Segoe UI"/>
-          <w:b/>
-          <w:bCs/>
-          <w:sz w:val="20"/>
-          <w:szCs w:val="20"/>
-          <w:lang w:val="pt-PT"/>
-        </w:rPr>
-        <w:t xml:space="preserve">O que mostra: </w:t>
-      </w:r>
-      <w:r>
-        <w:rPr>
-          <w:rFonts w:cs="Segoe UI"/>
-          <w:sz w:val="20"/>
-          <w:szCs w:val="20"/>
-          <w:lang w:val="pt-PT"/>
-        </w:rPr>
-        <w:t xml:space="preserve">quantas peças foram produzidas face às planeadas.</w:t>
-      </w:r>
-    </w:p>
-    <w:p>
-      <w:pPr>
-        <w:spacing w:after="60"/>
-        <w:ind w:left="720"/>
-        <w:jc w:val="both"/>
-        <w:rPr>
-          <w:sz w:val="20"/>
-          <w:lang w:val="pt-PT"/>
-        </w:rPr>
-      </w:pPr>
-      <w:r>
-        <w:rPr>
-          <w:rFonts w:cs="Segoe UI"/>
-          <w:b/>
-          <w:bCs/>
-          <w:sz w:val="20"/>
-          <w:szCs w:val="20"/>
-          <w:lang w:val="pt-PT"/>
-        </w:rPr>
-        <w:t xml:space="preserve">Como se obtém: </w:t>
-      </w:r>
-      <w:r>
-        <w:rPr>
-          <w:rFonts w:cs="Segoe UI"/>
-          <w:sz w:val="20"/>
-          <w:szCs w:val="20"/>
-          <w:lang w:val="pt-PT"/>
-        </w:rPr>
-        <w:t xml:space="preserve">peças produzidas ÷ peças planeadas, só para os dias do período até hoje (os dias futuros ainda não têm produção e não entram).</w:t>
-      </w:r>
-    </w:p>
-    <w:p>
-      <w:pPr>
-        <w:spacing w:after="60"/>
-        <w:ind w:left="720"/>
-        <w:jc w:val="both"/>
-        <w:rPr>
-          <w:sz w:val="20"/>
-          <w:lang w:val="pt-PT"/>
-        </w:rPr>
-      </w:pPr>
-      <w:r>
-        <w:rPr>
-          <w:rFonts w:cs="Segoe UI"/>
-          <w:b/>
-          <w:bCs/>
-          <w:sz w:val="20"/>
-          <w:szCs w:val="20"/>
-          <w:lang w:val="pt-PT"/>
-        </w:rPr>
-        <w:t xml:space="preserve">Como analisar: </w:t>
-      </w:r>
-      <w:r>
-        <w:rPr>
-          <w:rFonts w:cs="Segoe UI"/>
-          <w:sz w:val="20"/>
-          <w:szCs w:val="20"/>
-          <w:lang w:val="pt-PT"/>
-        </w:rPr>
-        <w:t xml:space="preserve">o ideal é perto de 100%. Muito abaixo indica peças em falta; muito acima indica produção além do plano. Clicar no cartão mostra item a item.</w:t>
-      </w:r>
-    </w:p>
-    <w:p>
-      <w:pPr>
-        <w:keepNext/>
-        <w:spacing w:before="200" w:after="60"/>
-        <w:ind w:left="720"/>
-        <w:rPr>
-          <w:sz w:val="20"/>
-          <w:lang w:val="pt-PT"/>
-        </w:rPr>
-      </w:pPr>
-      <w:r>
-        <w:rPr>
-          <w:rFonts w:cs="Segoe UI"/>
-          <w:b/>
-          <w:bCs/>
-          <w:u w:val="single"/>
-          <w:sz w:val="20"/>
-          <w:szCs w:val="20"/>
-          <w:lang w:val="pt-PT"/>
-        </w:rPr>
-        <w:t xml:space="preserve">Disponibilidade Matéria-Prima</w:t>
-      </w:r>
-    </w:p>
-    <w:p>
-      <w:pPr>
-        <w:spacing w:after="60"/>
-        <w:ind w:left="720"/>
-        <w:jc w:val="both"/>
-        <w:rPr>
-          <w:sz w:val="20"/>
-          <w:lang w:val="pt-PT"/>
-        </w:rPr>
-      </w:pPr>
-      <w:r>
-        <w:rPr>
-          <w:rFonts w:cs="Segoe UI"/>
-          <w:b/>
-          <w:bCs/>
-          <w:sz w:val="20"/>
-          <w:szCs w:val="20"/>
-          <w:lang w:val="pt-PT"/>
-        </w:rPr>
-        <w:t xml:space="preserve">O que mostra: </w:t>
-      </w:r>
-      <w:r>
-        <w:rPr>
-          <w:rFonts w:cs="Segoe UI"/>
-          <w:sz w:val="20"/>
-          <w:szCs w:val="20"/>
-          <w:lang w:val="pt-PT"/>
-        </w:rPr>
-        <w:t xml:space="preserve">se há matéria-prima para o que está para produzir a curto prazo.</w:t>
-      </w:r>
-    </w:p>
-    <w:p>
-      <w:pPr>
-        <w:spacing w:after="60"/>
-        <w:ind w:left="720"/>
-        <w:jc w:val="both"/>
-        <w:rPr>
-          <w:sz w:val="20"/>
-          <w:lang w:val="pt-PT"/>
-        </w:rPr>
-      </w:pPr>
-      <w:r>
-        <w:rPr>
-          <w:rFonts w:cs="Segoe UI"/>
-          <w:b/>
-          <w:bCs/>
-          <w:sz w:val="20"/>
-          <w:szCs w:val="20"/>
-          <w:lang w:val="pt-PT"/>
-        </w:rPr>
-        <w:t xml:space="preserve">Como se obtém: </w:t>
-      </w:r>
-      <w:r>
-        <w:rPr>
-          <w:rFonts w:cs="Segoe UI"/>
-          <w:sz w:val="20"/>
-          <w:szCs w:val="20"/>
-          <w:lang w:val="pt-PT"/>
-        </w:rPr>
-        <w:t xml:space="preserve">de todos os itens ainda por produzir com data até amanhã (incluindo o backlog e os ensaios de hoje e de amanhã), a percentagem que tem a matéria-prima marcada como OK.</w:t>
-      </w:r>
-    </w:p>
-    <w:p>
-      <w:pPr>
-        <w:spacing w:after="60"/>
-        <w:ind w:left="720"/>
-        <w:jc w:val="both"/>
-        <w:rPr>
-          <w:sz w:val="20"/>
-          <w:lang w:val="pt-PT"/>
-        </w:rPr>
-      </w:pPr>
-      <w:r>
-        <w:rPr>
-          <w:rFonts w:cs="Segoe UI"/>
-          <w:b/>
-          <w:bCs/>
-          <w:sz w:val="20"/>
-          <w:szCs w:val="20"/>
-          <w:lang w:val="pt-PT"/>
-        </w:rPr>
-        <w:t xml:space="preserve">Como analisar: </w:t>
-      </w:r>
-      <w:r>
-        <w:rPr>
-          <w:rFonts w:cs="Segoe UI"/>
-          <w:sz w:val="20"/>
-          <w:szCs w:val="20"/>
-          <w:lang w:val="pt-PT"/>
-        </w:rPr>
-        <w:t xml:space="preserve">abaixo de 100% há itens sem matéria-prima garantida; clicar no cartão mostra quais. Sem nada por produzir até amanhã, o cartão mostra «—».</w:t>
-      </w:r>
-    </w:p>
-    <w:p>
-      <w:pPr>
-        <w:keepNext/>
-        <w:spacing w:before="200" w:after="60"/>
-        <w:ind w:left="720"/>
-        <w:rPr>
-          <w:sz w:val="20"/>
-          <w:lang w:val="pt-PT"/>
-        </w:rPr>
-      </w:pPr>
-      <w:r>
-        <w:rPr>
-          <w:rFonts w:cs="Segoe UI"/>
-          <w:b/>
-          <w:bCs/>
-          <w:u w:val="single"/>
-          <w:sz w:val="20"/>
-          <w:szCs w:val="20"/>
-          <w:lang w:val="pt-PT"/>
-        </w:rPr>
-        <w:t xml:space="preserve">Disponibilidade Ferramenta</w:t>
-      </w:r>
-    </w:p>
-    <w:p>
-      <w:pPr>
-        <w:spacing w:after="60"/>
-        <w:ind w:left="720"/>
-        <w:jc w:val="both"/>
-        <w:rPr>
-          <w:sz w:val="20"/>
-          <w:lang w:val="pt-PT"/>
-        </w:rPr>
-      </w:pPr>
-      <w:r>
-        <w:rPr>
-          <w:rFonts w:cs="Segoe UI"/>
-          <w:b/>
-          <w:bCs/>
-          <w:sz w:val="20"/>
-          <w:szCs w:val="20"/>
-          <w:lang w:val="pt-PT"/>
-        </w:rPr>
-        <w:t xml:space="preserve">O que mostra / como se obtém: </w:t>
-      </w:r>
-      <w:r>
-        <w:rPr>
-          <w:rFonts w:cs="Segoe UI"/>
-          <w:sz w:val="20"/>
-          <w:szCs w:val="20"/>
-          <w:lang w:val="pt-PT"/>
-        </w:rPr>
-        <w:t xml:space="preserve">igual à anterior, mas para a ferramenta: dos itens por produzir até amanhã, a percentagem com a ferramenta marcada como OK.</w:t>
-      </w:r>
-    </w:p>
-    <w:p>
-      <w:pPr>
-        <w:spacing w:after="60"/>
-        <w:ind w:left="720"/>
-        <w:jc w:val="both"/>
-        <w:rPr>
-          <w:sz w:val="20"/>
-          <w:lang w:val="pt-PT"/>
-        </w:rPr>
-      </w:pPr>
-      <w:r>
-        <w:rPr>
-          <w:rFonts w:cs="Segoe UI"/>
-          <w:b/>
-          <w:bCs/>
-          <w:sz w:val="20"/>
-          <w:szCs w:val="20"/>
-          <w:lang w:val="pt-PT"/>
-        </w:rPr>
-        <w:t xml:space="preserve">Como analisar: </w:t>
-      </w:r>
-      <w:r>
-        <w:rPr>
-          <w:rFonts w:cs="Segoe UI"/>
-          <w:sz w:val="20"/>
-          <w:szCs w:val="20"/>
-          <w:lang w:val="pt-PT"/>
-        </w:rPr>
-        <w:t xml:space="preserve">clicar no cartão mostra os itens com ferramenta não disponível.</w:t>
-      </w:r>
-    </w:p>
-    <w:p>
-      <w:pPr>
-        <w:pStyle w:val="ListParagraph"/>
-        <w:numPr>
-          <w:ilvl w:val="0"/>
-          <w:numId w:val="27"/>
-        </w:numPr>
-        <w:spacing w:before="240"/>
-        <w:rPr>
-          <w:sz w:val="20"/>
-          <w:lang w:val="pt-PT"/>
-        </w:rPr>
-      </w:pPr>
-      <w:r>
-        <w:rPr>
-          <w:rFonts w:cs="Segoe UI"/>
-          <w:b/>
-          <w:bCs/>
-          <w:sz w:val="20"/>
-          <w:szCs w:val="20"/>
-          <w:lang w:val="pt-PT"/>
-        </w:rPr>
-        <w:t xml:space="preserve">Verificar o status</w:t>
-      </w:r>
-      <w:r>
-        <w:rPr>
-          <w:rFonts w:cs="Segoe UI"/>
-          <w:sz w:val="20"/>
-          <w:szCs w:val="20"/>
-          <w:lang w:val="pt-PT"/>
-        </w:rPr>
-        <w:t xml:space="preserve"> dos Centros de Custo.</w:t>
-      </w:r>
-    </w:p>
-    <w:p>
-      <w:pPr>
-        <w:spacing w:after="60"/>
-        <w:ind w:left="720"/>
-        <w:jc w:val="both"/>
-        <w:rPr>
-          <w:sz w:val="20"/>
-          <w:lang w:val="pt-PT"/>
-        </w:rPr>
-      </w:pPr>
-      <w:r>
-        <w:rPr>
-          <w:rFonts w:cs="Segoe UI"/>
-          <w:b/>
-          <w:bCs/>
-          <w:sz w:val="20"/>
-          <w:szCs w:val="20"/>
-          <w:lang w:val="pt-PT"/>
-        </w:rPr>
-        <w:t xml:space="preserve">Nota:</w:t>
-      </w:r>
-      <w:r>
-        <w:rPr>
-          <w:rFonts w:cs="Segoe UI"/>
-          <w:sz w:val="20"/>
-          <w:szCs w:val="20"/>
-          <w:lang w:val="pt-PT"/>
-        </w:rPr>
-        <w:t xml:space="preserve"> os CC’s devem variar num intervalo de 8H positivas e negativas.</w:t>
-      </w:r>
-    </w:p>
-    <w:p>
-      <w:pPr>
-        <w:spacing w:after="60"/>
-        <w:ind w:left="720"/>
-        <w:jc w:val="both"/>
-        <w:rPr>
-          <w:sz w:val="20"/>
-          <w:lang w:val="pt-PT"/>
-        </w:rPr>
-      </w:pPr>
-      <w:r>
-        <w:rPr>
-          <w:rFonts w:cs="Segoe UI"/>
-          <w:sz w:val="20"/>
-          <w:szCs w:val="20"/>
-          <w:lang w:val="pt-PT"/>
-        </w:rPr>
-        <w:t xml:space="preserve">Mais de 8H de atraso pode comprometer as operações seguintes.</w:t>
-      </w:r>
-    </w:p>
-    <w:p>
-      <w:pPr>
-        <w:spacing w:after="60"/>
-        <w:ind w:left="720"/>
-        <w:jc w:val="both"/>
-        <w:rPr>
-          <w:sz w:val="20"/>
-          <w:lang w:val="pt-PT"/>
-        </w:rPr>
-      </w:pPr>
-      <w:r>
-        <w:rPr>
-          <w:rFonts w:cs="Segoe UI"/>
-          <w:sz w:val="20"/>
-          <w:szCs w:val="20"/>
-          <w:lang w:val="pt-PT"/>
-        </w:rPr>
-        <w:t xml:space="preserve">Mais de 8H de avanço pode comprometer os indicadores de sustentabilidade.</w:t>
-      </w:r>
-    </w:p>
-    <w:p>
-      <w:pPr>
-        <w:keepNext/>
-        <w:spacing w:before="120" w:after="60"/>
-        <w:jc w:val="center"/>
       </w:pPr>
       <w:r>
         <w:rPr>
           <w:noProof/>
+          <w:sz w:val="20"/>
+          <w:szCs w:val="22"/>
           <w:lang w:val="pt-PT"/>
         </w:rPr>
         <w:drawing>
-          <wp:inline distT="0" distB="0" distL="0" distR="0">
-            <wp:extent cx="5040000" cy="3142544"/>
-            <wp:effectExtent l="0" t="0" r="0" b="0"/>
-            <wp:docPr id="9004" name="Imagem 9004"/>
+          <wp:anchor distT="0" distB="0" distL="114300" distR="114300" simplePos="0" relativeHeight="251931648" behindDoc="1" locked="0" layoutInCell="1" allowOverlap="1" wp14:anchorId="2A1D63CE" wp14:editId="6F02E18C">
+            <wp:simplePos x="0" y="0"/>
+            <wp:positionH relativeFrom="margin">
+              <wp:align>center</wp:align>
+            </wp:positionH>
+            <wp:positionV relativeFrom="paragraph">
+              <wp:posOffset>306070</wp:posOffset>
+            </wp:positionV>
+            <wp:extent cx="6124575" cy="1745615"/>
+            <wp:effectExtent l="0" t="0" r="9525" b="6985"/>
+            <wp:wrapTight wrapText="bothSides">
+              <wp:wrapPolygon edited="0">
+                <wp:start x="0" y="0"/>
+                <wp:lineTo x="0" y="21451"/>
+                <wp:lineTo x="21566" y="21451"/>
+                <wp:lineTo x="21566" y="0"/>
+                <wp:lineTo x="0" y="0"/>
+              </wp:wrapPolygon>
+            </wp:wrapTight>
+            <wp:docPr id="828016023" name="Picture 1"/>
             <wp:cNvGraphicFramePr>
               <a:graphicFrameLocks xmlns:a="http://schemas.openxmlformats.org/drawingml/2006/main" noChangeAspect="1"/>
             </wp:cNvGraphicFramePr>
@@ -1384,11 +939,17 @@
               <a:graphicData uri="http://schemas.openxmlformats.org/drawingml/2006/picture">
                 <pic:pic xmlns:pic="http://schemas.openxmlformats.org/drawingml/2006/picture">
                   <pic:nvPicPr>
-                    <pic:cNvPr id="9004" name="pvp_05_ccs.png"/>
+                    <pic:cNvPr id="828016023" name=""/>
                     <pic:cNvPicPr/>
                   </pic:nvPicPr>
                   <pic:blipFill>
-                    <a:blip r:embed="rId504"/>
+                    <a:blip r:embed="rId19">
+                      <a:extLst>
+                        <a:ext uri="{28A0092B-C50C-407E-A947-70E740481C1C}">
+                          <a14:useLocalDpi xmlns:a14="http://schemas.microsoft.com/office/drawing/2010/main" val="0"/>
+                        </a:ext>
+                      </a:extLst>
+                    </a:blip>
                     <a:stretch>
                       <a:fillRect/>
                     </a:stretch>
@@ -1396,7 +957,7 @@
                   <pic:spPr>
                     <a:xfrm>
                       <a:off x="0" y="0"/>
-                      <a:ext cx="5040000" cy="3142544"/>
+                      <a:ext cx="6124575" cy="1745615"/>
                     </a:xfrm>
                     <a:prstGeom prst="rect">
                       <a:avLst/>
@@ -1405,618 +966,27 @@
                 </pic:pic>
               </a:graphicData>
             </a:graphic>
-          </wp:inline>
+          </wp:anchor>
         </w:drawing>
       </w:r>
     </w:p>
     <w:p>
       <w:pPr>
-        <w:spacing w:after="120"/>
-        <w:jc w:val="center"/>
-      </w:pPr>
-      <w:r>
         <w:rPr>
-          <w:rFonts w:cs="Segoe UI"/>
-          <w:i/>
-          <w:iCs/>
-          <w:sz w:val="16"/>
-          <w:szCs w:val="16"/>
+          <w:sz w:val="20"/>
+          <w:szCs w:val="22"/>
           <w:lang w:val="pt-PT"/>
         </w:rPr>
-        <w:t xml:space="preserve">Cartões dos C.C. (um aberto)</w:t>
-      </w:r>
+      </w:pPr>
     </w:p>
     <w:p>
       <w:pPr>
-        <w:spacing w:after="60"/>
-        <w:ind w:left="720"/>
-        <w:jc w:val="both"/>
         <w:rPr>
           <w:sz w:val="20"/>
+          <w:szCs w:val="22"/>
           <w:lang w:val="pt-PT"/>
         </w:rPr>
       </w:pPr>
-      <w:r>
-        <w:rPr>
-          <w:rFonts w:cs="Segoe UI"/>
-          <w:b/>
-          <w:bCs/>
-          <w:sz w:val="20"/>
-          <w:szCs w:val="20"/>
-          <w:lang w:val="pt-PT"/>
-        </w:rPr>
-        <w:t xml:space="preserve">O que mostra: </w:t>
-      </w:r>
-      <w:r>
-        <w:rPr>
-          <w:rFonts w:cs="Segoe UI"/>
-          <w:sz w:val="20"/>
-          <w:szCs w:val="20"/>
-          <w:lang w:val="pt-PT"/>
-        </w:rPr>
-        <w:t xml:space="preserve">cada C.C. com o seu avanço (+) ou atraso (–) em horas. Clicar no C.C. abre o cartão com o detalhe por dia. Abrir um ou mais cartões também filtra o material em risco, a MOD e o trabalho extra para esses C.C.</w:t>
-      </w:r>
-    </w:p>
-    <w:p>
-      <w:pPr>
-        <w:spacing w:after="60"/>
-        <w:ind w:left="720"/>
-        <w:jc w:val="both"/>
-        <w:rPr>
-          <w:sz w:val="20"/>
-          <w:lang w:val="pt-PT"/>
-        </w:rPr>
-      </w:pPr>
-      <w:r>
-        <w:rPr>
-          <w:rFonts w:cs="Segoe UI"/>
-          <w:b/>
-          <w:bCs/>
-          <w:sz w:val="20"/>
-          <w:szCs w:val="20"/>
-          <w:lang w:val="pt-PT"/>
-        </w:rPr>
-        <w:t xml:space="preserve">Como se obtém o avanço/atraso: </w:t>
-      </w:r>
-      <w:r>
-        <w:rPr>
-          <w:rFonts w:cs="Segoe UI"/>
-          <w:sz w:val="20"/>
-          <w:szCs w:val="20"/>
-          <w:lang w:val="pt-PT"/>
-        </w:rPr>
-        <w:t xml:space="preserve">horas produzidas – horas planeadas, contando:</w:t>
-      </w:r>
-    </w:p>
-    <w:p>
-      <w:pPr>
-        <w:spacing w:after="40"/>
-        <w:ind w:left="1080" w:hanging="220"/>
-        <w:jc w:val="both"/>
-        <w:rPr>
-          <w:sz w:val="20"/>
-          <w:lang w:val="pt-PT"/>
-        </w:rPr>
-      </w:pPr>
-      <w:r>
-        <w:rPr>
-          <w:rFonts w:cs="Segoe UI"/>
-          <w:sz w:val="20"/>
-          <w:szCs w:val="20"/>
-          <w:lang w:val="pt-PT"/>
-        </w:rPr>
-        <w:t xml:space="preserve">– </w:t>
-      </w:r>
-      <w:r>
-        <w:rPr>
-          <w:rFonts w:cs="Segoe UI"/>
-          <w:sz w:val="20"/>
-          <w:szCs w:val="20"/>
-          <w:lang w:val="pt-PT"/>
-        </w:rPr>
-        <w:t xml:space="preserve">os dias do período até hoje e o backlog (trabalho de dias anteriores ainda por fazer);</w:t>
-      </w:r>
-    </w:p>
-    <w:p>
-      <w:pPr>
-        <w:spacing w:after="40"/>
-        <w:ind w:left="1080" w:hanging="220"/>
-        <w:jc w:val="both"/>
-        <w:rPr>
-          <w:sz w:val="20"/>
-          <w:lang w:val="pt-PT"/>
-        </w:rPr>
-      </w:pPr>
-      <w:r>
-        <w:rPr>
-          <w:rFonts w:cs="Segoe UI"/>
-          <w:sz w:val="20"/>
-          <w:szCs w:val="20"/>
-          <w:lang w:val="pt-PT"/>
-        </w:rPr>
-        <w:t xml:space="preserve">– </w:t>
-      </w:r>
-      <w:r>
-        <w:rPr>
-          <w:rFonts w:cs="Segoe UI"/>
-          <w:sz w:val="20"/>
-          <w:szCs w:val="20"/>
-          <w:lang w:val="pt-PT"/>
-        </w:rPr>
-        <w:t xml:space="preserve">as horas de trabalho que ainda faltam hoje, porque o dia de hoje ainda não acabou (um C.C. de 2 turnos trabalha das 6h às 23h; um de 3 turnos, o dia todo);</w:t>
-      </w:r>
-    </w:p>
-    <w:p>
-      <w:pPr>
-        <w:spacing w:after="40"/>
-        <w:ind w:left="1080" w:hanging="220"/>
-        <w:jc w:val="both"/>
-        <w:rPr>
-          <w:sz w:val="20"/>
-          <w:lang w:val="pt-PT"/>
-        </w:rPr>
-      </w:pPr>
-      <w:r>
-        <w:rPr>
-          <w:rFonts w:cs="Segoe UI"/>
-          <w:sz w:val="20"/>
-          <w:szCs w:val="20"/>
-          <w:lang w:val="pt-PT"/>
-        </w:rPr>
-        <w:t xml:space="preserve">– </w:t>
-      </w:r>
-      <w:r>
-        <w:rPr>
-          <w:rFonts w:cs="Segoe UI"/>
-          <w:sz w:val="20"/>
-          <w:szCs w:val="20"/>
-          <w:lang w:val="pt-PT"/>
-        </w:rPr>
-        <w:t xml:space="preserve">nos dias futuros, só o que já foi produzido (é produção adiantada).</w:t>
-      </w:r>
-    </w:p>
-    <w:p>
-      <w:pPr>
-        <w:spacing w:after="60"/>
-        <w:ind w:left="720"/>
-        <w:jc w:val="both"/>
-        <w:rPr>
-          <w:sz w:val="20"/>
-          <w:lang w:val="pt-PT"/>
-        </w:rPr>
-      </w:pPr>
-      <w:r>
-        <w:rPr>
-          <w:rFonts w:cs="Segoe UI"/>
-          <w:b/>
-          <w:bCs/>
-          <w:sz w:val="20"/>
-          <w:szCs w:val="20"/>
-          <w:lang w:val="pt-PT"/>
-        </w:rPr>
-        <w:t xml:space="preserve">Exemplo:</w:t>
-      </w:r>
-      <w:r>
-        <w:rPr>
-          <w:rFonts w:cs="Segoe UI"/>
-          <w:sz w:val="20"/>
-          <w:szCs w:val="20"/>
-          <w:lang w:val="pt-PT"/>
-        </w:rPr>
-        <w:t xml:space="preserve"> planeado até hoje 20h, produzido 15h e faltam 4h de trabalho hoje → 15 – 20 + 4 = –1h (1 hora de atraso).</w:t>
-      </w:r>
-    </w:p>
-    <w:p>
-      <w:pPr>
-        <w:spacing w:after="60"/>
-        <w:ind w:left="720"/>
-        <w:jc w:val="both"/>
-        <w:rPr>
-          <w:sz w:val="20"/>
-          <w:lang w:val="pt-PT"/>
-        </w:rPr>
-      </w:pPr>
-      <w:r>
-        <w:rPr>
-          <w:rFonts w:cs="Segoe UI"/>
-          <w:b/>
-          <w:bCs/>
-          <w:sz w:val="20"/>
-          <w:szCs w:val="20"/>
-          <w:lang w:val="pt-PT"/>
-        </w:rPr>
-        <w:t xml:space="preserve">Ensaios de ferramenta</w:t>
-      </w:r>
-      <w:r>
-        <w:rPr>
-          <w:rFonts w:cs="Segoe UI"/>
-          <w:sz w:val="20"/>
-          <w:szCs w:val="20"/>
-          <w:lang w:val="pt-PT"/>
-        </w:rPr>
-        <w:t xml:space="preserve"> (símbolo do frasco): cada ensaio ocupa um dia de trabalho (7h); havendo vários no mesmo C.C. e dia, as 7h dividem-se entre eles.</w:t>
-      </w:r>
-    </w:p>
-    <w:p>
-      <w:pPr>
-        <w:keepNext/>
-        <w:spacing w:before="120" w:after="60"/>
-        <w:jc w:val="center"/>
-      </w:pPr>
-      <w:r>
-        <w:rPr>
-          <w:noProof/>
-          <w:lang w:val="pt-PT"/>
-        </w:rPr>
-        <w:drawing>
-          <wp:inline distT="0" distB="0" distL="0" distR="0">
-            <wp:extent cx="3420000" cy="2371268"/>
-            <wp:effectExtent l="0" t="0" r="0" b="0"/>
-            <wp:docPr id="9005" name="Imagem 9005"/>
-            <wp:cNvGraphicFramePr>
-              <a:graphicFrameLocks xmlns:a="http://schemas.openxmlformats.org/drawingml/2006/main" noChangeAspect="1"/>
-            </wp:cNvGraphicFramePr>
-            <a:graphic xmlns:a="http://schemas.openxmlformats.org/drawingml/2006/main">
-              <a:graphicData uri="http://schemas.openxmlformats.org/drawingml/2006/picture">
-                <pic:pic xmlns:pic="http://schemas.openxmlformats.org/drawingml/2006/picture">
-                  <pic:nvPicPr>
-                    <pic:cNvPr id="9005" name="pvp_06_cartao_cc.png"/>
-                    <pic:cNvPicPr/>
-                  </pic:nvPicPr>
-                  <pic:blipFill>
-                    <a:blip r:embed="rId505"/>
-                    <a:stretch>
-                      <a:fillRect/>
-                    </a:stretch>
-                  </pic:blipFill>
-                  <pic:spPr>
-                    <a:xfrm>
-                      <a:off x="0" y="0"/>
-                      <a:ext cx="3420000" cy="2371268"/>
-                    </a:xfrm>
-                    <a:prstGeom prst="rect">
-                      <a:avLst/>
-                    </a:prstGeom>
-                  </pic:spPr>
-                </pic:pic>
-              </a:graphicData>
-            </a:graphic>
-          </wp:inline>
-        </w:drawing>
-      </w:r>
-    </w:p>
-    <w:p>
-      <w:pPr>
-        <w:spacing w:after="120"/>
-        <w:jc w:val="center"/>
-      </w:pPr>
-      <w:r>
-        <w:rPr>
-          <w:rFonts w:cs="Segoe UI"/>
-          <w:i/>
-          <w:iCs/>
-          <w:sz w:val="16"/>
-          <w:szCs w:val="16"/>
-          <w:lang w:val="pt-PT"/>
-        </w:rPr>
-        <w:t xml:space="preserve">Cartão de um C.C.</w:t>
-      </w:r>
-    </w:p>
-    <w:p>
-      <w:pPr>
-        <w:spacing w:after="60"/>
-        <w:ind w:left="720"/>
-        <w:jc w:val="both"/>
-        <w:rPr>
-          <w:sz w:val="20"/>
-          <w:lang w:val="pt-PT"/>
-        </w:rPr>
-      </w:pPr>
-      <w:r>
-        <w:rPr>
-          <w:rFonts w:cs="Segoe UI"/>
-          <w:b/>
-          <w:bCs/>
-          <w:sz w:val="20"/>
-          <w:szCs w:val="20"/>
-          <w:lang w:val="pt-PT"/>
-        </w:rPr>
-        <w:t xml:space="preserve">Como ler a tabela do cartão: </w:t>
-      </w:r>
-      <w:r>
-        <w:rPr>
-          <w:rFonts w:cs="Segoe UI"/>
-          <w:sz w:val="20"/>
-          <w:szCs w:val="20"/>
-          <w:lang w:val="pt-PT"/>
-        </w:rPr>
-        <w:t xml:space="preserve"/>
-      </w:r>
-    </w:p>
-    <w:p>
-      <w:pPr>
-        <w:spacing w:after="40"/>
-        <w:ind w:left="1080" w:hanging="220"/>
-        <w:jc w:val="both"/>
-        <w:rPr>
-          <w:sz w:val="20"/>
-          <w:lang w:val="pt-PT"/>
-        </w:rPr>
-      </w:pPr>
-      <w:r>
-        <w:rPr>
-          <w:rFonts w:cs="Segoe UI"/>
-          <w:sz w:val="20"/>
-          <w:szCs w:val="20"/>
-          <w:lang w:val="pt-PT"/>
-        </w:rPr>
-        <w:t xml:space="preserve">– </w:t>
-      </w:r>
-      <w:r>
-        <w:rPr>
-          <w:rFonts w:cs="Segoe UI"/>
-          <w:b/>
-          <w:bCs/>
-          <w:sz w:val="20"/>
-          <w:szCs w:val="20"/>
-          <w:lang w:val="pt-PT"/>
-        </w:rPr>
-        <w:t xml:space="preserve">Backlog</w:t>
-      </w:r>
-      <w:r>
-        <w:rPr>
-          <w:rFonts w:cs="Segoe UI"/>
-          <w:sz w:val="20"/>
-          <w:szCs w:val="20"/>
-          <w:lang w:val="pt-PT"/>
-        </w:rPr>
-        <w:t xml:space="preserve"> (faixa laranja, quando existe): horas de dias anteriores ainda por produzir. Contam como atraso. Clicar mostra os itens.</w:t>
-      </w:r>
-    </w:p>
-    <w:p>
-      <w:pPr>
-        <w:spacing w:after="40"/>
-        <w:ind w:left="1080" w:hanging="220"/>
-        <w:jc w:val="both"/>
-        <w:rPr>
-          <w:sz w:val="20"/>
-          <w:lang w:val="pt-PT"/>
-        </w:rPr>
-      </w:pPr>
-      <w:r>
-        <w:rPr>
-          <w:rFonts w:cs="Segoe UI"/>
-          <w:sz w:val="20"/>
-          <w:szCs w:val="20"/>
-          <w:lang w:val="pt-PT"/>
-        </w:rPr>
-        <w:t xml:space="preserve">– </w:t>
-      </w:r>
-      <w:r>
-        <w:rPr>
-          <w:rFonts w:cs="Segoe UI"/>
-          <w:b/>
-          <w:bCs/>
-          <w:sz w:val="20"/>
-          <w:szCs w:val="20"/>
-          <w:lang w:val="pt-PT"/>
-        </w:rPr>
-        <w:t xml:space="preserve">Planeado</w:t>
-      </w:r>
-      <w:r>
-        <w:rPr>
-          <w:rFonts w:cs="Segoe UI"/>
-          <w:sz w:val="20"/>
-          <w:szCs w:val="20"/>
-          <w:lang w:val="pt-PT"/>
-        </w:rPr>
-        <w:t xml:space="preserve">: horas planeadas para essa data.</w:t>
-      </w:r>
-    </w:p>
-    <w:p>
-      <w:pPr>
-        <w:spacing w:after="40"/>
-        <w:ind w:left="1080" w:hanging="220"/>
-        <w:jc w:val="both"/>
-        <w:rPr>
-          <w:sz w:val="20"/>
-          <w:lang w:val="pt-PT"/>
-        </w:rPr>
-      </w:pPr>
-      <w:r>
-        <w:rPr>
-          <w:rFonts w:cs="Segoe UI"/>
-          <w:sz w:val="20"/>
-          <w:szCs w:val="20"/>
-          <w:lang w:val="pt-PT"/>
-        </w:rPr>
-        <w:t xml:space="preserve">– </w:t>
-      </w:r>
-      <w:r>
-        <w:rPr>
-          <w:rFonts w:cs="Segoe UI"/>
-          <w:b/>
-          <w:bCs/>
-          <w:sz w:val="20"/>
-          <w:szCs w:val="20"/>
-          <w:lang w:val="pt-PT"/>
-        </w:rPr>
-        <w:t xml:space="preserve">Produzido – do plano</w:t>
-      </w:r>
-      <w:r>
-        <w:rPr>
-          <w:rFonts w:cs="Segoe UI"/>
-          <w:sz w:val="20"/>
-          <w:szCs w:val="20"/>
-          <w:lang w:val="pt-PT"/>
-        </w:rPr>
-        <w:t xml:space="preserve">: do que estava planeado para esse dia, quanto já está feito (mesmo que tenha sido feito noutro dia). É o que conta para o avanço/atraso.</w:t>
-      </w:r>
-    </w:p>
-    <w:p>
-      <w:pPr>
-        <w:spacing w:after="40"/>
-        <w:ind w:left="1080" w:hanging="220"/>
-        <w:jc w:val="both"/>
-        <w:rPr>
-          <w:sz w:val="20"/>
-          <w:lang w:val="pt-PT"/>
-        </w:rPr>
-      </w:pPr>
-      <w:r>
-        <w:rPr>
-          <w:rFonts w:cs="Segoe UI"/>
-          <w:sz w:val="20"/>
-          <w:szCs w:val="20"/>
-          <w:lang w:val="pt-PT"/>
-        </w:rPr>
-        <w:t xml:space="preserve">– </w:t>
-      </w:r>
-      <w:r>
-        <w:rPr>
-          <w:rFonts w:cs="Segoe UI"/>
-          <w:b/>
-          <w:bCs/>
-          <w:sz w:val="20"/>
-          <w:szCs w:val="20"/>
-          <w:lang w:val="pt-PT"/>
-        </w:rPr>
-        <w:t xml:space="preserve">Produzido – no dia</w:t>
-      </w:r>
-      <w:r>
-        <w:rPr>
-          <w:rFonts w:cs="Segoe UI"/>
-          <w:sz w:val="20"/>
-          <w:szCs w:val="20"/>
-          <w:lang w:val="pt-PT"/>
-        </w:rPr>
-        <w:t xml:space="preserve">: tudo o que se produziu efetivamente nesse dia, seja de que plano for (inclui recuperar atrasos e adiantar trabalho). É só informativo.</w:t>
-      </w:r>
-    </w:p>
-    <w:p>
-      <w:pPr>
-        <w:spacing w:after="40"/>
-        <w:ind w:left="1080" w:hanging="220"/>
-        <w:jc w:val="both"/>
-        <w:rPr>
-          <w:sz w:val="20"/>
-          <w:lang w:val="pt-PT"/>
-        </w:rPr>
-      </w:pPr>
-      <w:r>
-        <w:rPr>
-          <w:rFonts w:cs="Segoe UI"/>
-          <w:sz w:val="20"/>
-          <w:szCs w:val="20"/>
-          <w:lang w:val="pt-PT"/>
-        </w:rPr>
-        <w:t xml:space="preserve">– </w:t>
-      </w:r>
-      <w:r>
-        <w:rPr>
-          <w:rFonts w:cs="Segoe UI"/>
-          <w:sz w:val="20"/>
-          <w:szCs w:val="20"/>
-          <w:lang w:val="pt-PT"/>
-        </w:rPr>
-        <w:t xml:space="preserve">Passar o rato por cima de «do plano» ou de «no dia» mostra os KAs que compõem o valor.</w:t>
-      </w:r>
-    </w:p>
-    <w:p>
-      <w:pPr>
-        <w:keepNext/>
-        <w:spacing w:before="120" w:after="60"/>
-        <w:jc w:val="center"/>
-      </w:pPr>
-      <w:r>
-        <w:rPr>
-          <w:noProof/>
-          <w:lang w:val="pt-PT"/>
-        </w:rPr>
-        <w:drawing>
-          <wp:inline distT="0" distB="0" distL="0" distR="0">
-            <wp:extent cx="4500000" cy="4245283"/>
-            <wp:effectExtent l="0" t="0" r="0" b="0"/>
-            <wp:docPr id="9006" name="Imagem 9006"/>
-            <wp:cNvGraphicFramePr>
-              <a:graphicFrameLocks xmlns:a="http://schemas.openxmlformats.org/drawingml/2006/main" noChangeAspect="1"/>
-            </wp:cNvGraphicFramePr>
-            <a:graphic xmlns:a="http://schemas.openxmlformats.org/drawingml/2006/main">
-              <a:graphicData uri="http://schemas.openxmlformats.org/drawingml/2006/picture">
-                <pic:pic xmlns:pic="http://schemas.openxmlformats.org/drawingml/2006/picture">
-                  <pic:nvPicPr>
-                    <pic:cNvPr id="9006" name="pvp_07_popup_delta.png"/>
-                    <pic:cNvPicPr/>
-                  </pic:nvPicPr>
-                  <pic:blipFill>
-                    <a:blip r:embed="rId506"/>
-                    <a:stretch>
-                      <a:fillRect/>
-                    </a:stretch>
-                  </pic:blipFill>
-                  <pic:spPr>
-                    <a:xfrm>
-                      <a:off x="0" y="0"/>
-                      <a:ext cx="4500000" cy="4245283"/>
-                    </a:xfrm>
-                    <a:prstGeom prst="rect">
-                      <a:avLst/>
-                    </a:prstGeom>
-                  </pic:spPr>
-                </pic:pic>
-              </a:graphicData>
-            </a:graphic>
-          </wp:inline>
-        </w:drawing>
-      </w:r>
-    </w:p>
-    <w:p>
-      <w:pPr>
-        <w:spacing w:after="120"/>
-        <w:jc w:val="center"/>
-      </w:pPr>
-      <w:r>
-        <w:rPr>
-          <w:rFonts w:cs="Segoe UI"/>
-          <w:i/>
-          <w:iCs/>
-          <w:sz w:val="16"/>
-          <w:szCs w:val="16"/>
-          <w:lang w:val="pt-PT"/>
-        </w:rPr>
-        <w:t xml:space="preserve">Detalhe do avanço/atraso (clicar no valor do cartão)</w:t>
-      </w:r>
-    </w:p>
-    <w:p>
-      <w:pPr>
-        <w:spacing w:after="60"/>
-        <w:ind w:left="720"/>
-        <w:jc w:val="both"/>
-        <w:rPr>
-          <w:sz w:val="20"/>
-          <w:lang w:val="pt-PT"/>
-        </w:rPr>
-      </w:pPr>
-      <w:r>
-        <w:rPr>
-          <w:rFonts w:cs="Segoe UI"/>
-          <w:b/>
-          <w:bCs/>
-          <w:sz w:val="20"/>
-          <w:szCs w:val="20"/>
-          <w:lang w:val="pt-PT"/>
-        </w:rPr>
-        <w:t xml:space="preserve">Como analisar: </w:t>
-      </w:r>
-      <w:r>
-        <w:rPr>
-          <w:rFonts w:cs="Segoe UI"/>
-          <w:sz w:val="20"/>
-          <w:szCs w:val="20"/>
-          <w:lang w:val="pt-PT"/>
-        </w:rPr>
-        <w:t xml:space="preserve">clicar no valor do avanço/atraso do cartão abre a conta linha a linha: cada KA, o que estava planeado, o que foi produzido e quanto contribui para o resultado.</w:t>
-      </w:r>
     </w:p>
     <w:p>
       <w:pPr>
@@ -2025,9 +995,11 @@
           <w:ilvl w:val="0"/>
           <w:numId w:val="27"/>
         </w:numPr>
-        <w:spacing w:before="240"/>
         <w:rPr>
+          <w:b/>
+          <w:bCs/>
           <w:sz w:val="20"/>
+          <w:szCs w:val="16"/>
           <w:lang w:val="pt-PT"/>
         </w:rPr>
       </w:pPr>
@@ -2035,7 +1007,7 @@
         <w:rPr>
           <w:rFonts w:cs="Segoe UI"/>
           <w:sz w:val="20"/>
-          <w:szCs w:val="20"/>
+          <w:szCs w:val="18"/>
           <w:lang w:val="pt-PT"/>
         </w:rPr>
         <w:t xml:space="preserve">Verificar </w:t>
@@ -2046,19 +1018,10 @@
           <w:b/>
           <w:bCs/>
           <w:sz w:val="20"/>
-          <w:szCs w:val="20"/>
+          <w:szCs w:val="18"/>
           <w:lang w:val="pt-PT"/>
         </w:rPr>
-        <w:t xml:space="preserve">material em risco de falha</w:t>
-      </w:r>
-      <w:r>
-        <w:rPr>
-          <w:rFonts w:cs="Segoe UI"/>
-          <w:sz w:val="20"/>
-          <w:szCs w:val="20"/>
-          <w:lang w:val="pt-PT"/>
-        </w:rPr>
-        <w:t xml:space="preserve">.</w:t>
+        <w:t>material em risco de falha.</w:t>
       </w:r>
     </w:p>
     <w:p>
@@ -2152,20 +1115,49 @@
     </w:p>
     <w:p>
       <w:pPr>
-        <w:keepNext/>
-        <w:spacing w:before="120" w:after="60"/>
-        <w:jc w:val="center"/>
+        <w:rPr>
+          <w:sz w:val="20"/>
+          <w:szCs w:val="22"/>
+          <w:lang w:val="pt-PT"/>
+        </w:rPr>
+      </w:pPr>
+    </w:p>
+    <w:p>
+      <w:pPr>
+        <w:rPr>
+          <w:sz w:val="20"/>
+          <w:szCs w:val="22"/>
+          <w:lang w:val="pt-PT"/>
+        </w:rPr>
       </w:pPr>
       <w:r>
         <w:rPr>
           <w:noProof/>
+          <w:sz w:val="20"/>
+          <w:szCs w:val="22"/>
           <w:lang w:val="pt-PT"/>
         </w:rPr>
         <w:drawing>
-          <wp:inline distT="0" distB="0" distL="0" distR="0">
-            <wp:extent cx="5400000" cy="2960662"/>
-            <wp:effectExtent l="0" t="0" r="0" b="0"/>
-            <wp:docPr id="9007" name="Imagem 9007"/>
+          <wp:anchor distT="0" distB="0" distL="114300" distR="114300" simplePos="0" relativeHeight="251932672" behindDoc="1" locked="0" layoutInCell="1" allowOverlap="1" wp14:anchorId="5E8B6A0B" wp14:editId="1BE05AC3">
+            <wp:simplePos x="0" y="0"/>
+            <wp:positionH relativeFrom="margin">
+              <wp:align>center</wp:align>
+            </wp:positionH>
+            <wp:positionV relativeFrom="paragraph">
+              <wp:posOffset>149225</wp:posOffset>
+            </wp:positionV>
+            <wp:extent cx="6324600" cy="3158490"/>
+            <wp:effectExtent l="0" t="0" r="0" b="3810"/>
+            <wp:wrapTight wrapText="bothSides">
+              <wp:wrapPolygon edited="0">
+                <wp:start x="0" y="0"/>
+                <wp:lineTo x="0" y="21496"/>
+                <wp:lineTo x="21535" y="21496"/>
+                <wp:lineTo x="21535" y="0"/>
+                <wp:lineTo x="0" y="0"/>
+              </wp:wrapPolygon>
+            </wp:wrapTight>
+            <wp:docPr id="842493127" name="Picture 1"/>
             <wp:cNvGraphicFramePr>
               <a:graphicFrameLocks xmlns:a="http://schemas.openxmlformats.org/drawingml/2006/main" noChangeAspect="1"/>
             </wp:cNvGraphicFramePr>
@@ -2173,11 +1165,17 @@
               <a:graphicData uri="http://schemas.openxmlformats.org/drawingml/2006/picture">
                 <pic:pic xmlns:pic="http://schemas.openxmlformats.org/drawingml/2006/picture">
                   <pic:nvPicPr>
-                    <pic:cNvPr id="9007" name="pvp_08_risco.png"/>
+                    <pic:cNvPr id="842493127" name=""/>
                     <pic:cNvPicPr/>
                   </pic:nvPicPr>
                   <pic:blipFill>
-                    <a:blip r:embed="rId507"/>
+                    <a:blip r:embed="rId20">
+                      <a:extLst>
+                        <a:ext uri="{28A0092B-C50C-407E-A947-70E740481C1C}">
+                          <a14:useLocalDpi xmlns:a14="http://schemas.microsoft.com/office/drawing/2010/main" val="0"/>
+                        </a:ext>
+                      </a:extLst>
+                    </a:blip>
                     <a:stretch>
                       <a:fillRect/>
                     </a:stretch>
@@ -2185,7 +1183,7 @@
                   <pic:spPr>
                     <a:xfrm>
                       <a:off x="0" y="0"/>
-                      <a:ext cx="5400000" cy="2960662"/>
+                      <a:ext cx="6324600" cy="3158490"/>
                     </a:xfrm>
                     <a:prstGeom prst="rect">
                       <a:avLst/>
@@ -2194,781 +1192,76 @@
                 </pic:pic>
               </a:graphicData>
             </a:graphic>
-          </wp:inline>
+            <wp14:sizeRelH relativeFrom="margin">
+              <wp14:pctWidth>0</wp14:pctWidth>
+            </wp14:sizeRelH>
+            <wp14:sizeRelV relativeFrom="margin">
+              <wp14:pctHeight>0</wp14:pctHeight>
+            </wp14:sizeRelV>
+          </wp:anchor>
         </w:drawing>
       </w:r>
     </w:p>
     <w:p>
       <w:pPr>
-        <w:spacing w:after="120"/>
-        <w:jc w:val="center"/>
-      </w:pPr>
-      <w:r>
         <w:rPr>
-          <w:rFonts w:cs="Segoe UI"/>
-          <w:i/>
-          <w:iCs/>
-          <w:sz w:val="16"/>
-          <w:szCs w:val="16"/>
+          <w:sz w:val="20"/>
+          <w:szCs w:val="22"/>
           <w:lang w:val="pt-PT"/>
         </w:rPr>
-        <w:t xml:space="preserve">Material em risco de falha</w:t>
-      </w:r>
+      </w:pPr>
     </w:p>
     <w:p>
       <w:pPr>
-        <w:spacing w:after="60"/>
-        <w:ind w:left="720"/>
-        <w:jc w:val="both"/>
+        <w:rPr>
+          <w:sz w:val="20"/>
+          <w:szCs w:val="22"/>
+          <w:lang w:val="pt-PT"/>
+        </w:rPr>
+      </w:pPr>
+    </w:p>
+    <w:p>
+      <w:pPr>
+        <w:rPr>
+          <w:sz w:val="20"/>
+          <w:szCs w:val="22"/>
+          <w:lang w:val="pt-PT"/>
+        </w:rPr>
+      </w:pPr>
+    </w:p>
+    <w:p>
+      <w:pPr>
+        <w:rPr>
+          <w:sz w:val="20"/>
+          <w:szCs w:val="22"/>
+          <w:lang w:val="pt-PT"/>
+        </w:rPr>
+      </w:pPr>
+    </w:p>
+    <w:p>
+      <w:pPr>
         <w:rPr>
           <w:sz w:val="20"/>
           <w:lang w:val="pt-PT"/>
         </w:rPr>
       </w:pPr>
-      <w:r>
-        <w:rPr>
-          <w:rFonts w:cs="Segoe UI"/>
-          <w:b/>
-          <w:bCs/>
-          <w:sz w:val="20"/>
-          <w:szCs w:val="20"/>
-          <w:lang w:val="pt-PT"/>
-        </w:rPr>
-        <w:t xml:space="preserve">O que mostra: </w:t>
-      </w:r>
-      <w:r>
-        <w:rPr>
-          <w:rFonts w:cs="Segoe UI"/>
-          <w:sz w:val="20"/>
-          <w:szCs w:val="20"/>
-          <w:lang w:val="pt-PT"/>
-        </w:rPr>
-        <w:t xml:space="preserve">os materiais (KA) necessários para o que ainda está por produzir (período e backlog) que, pelo MD07, vão faltar nos próximos 2 dias de produção.</w:t>
-      </w:r>
+      <w:bookmarkStart w:id="1" w:name="_Hlk173928783"/>
     </w:p>
     <w:p>
       <w:pPr>
-        <w:spacing w:after="60"/>
-        <w:ind w:left="720"/>
-        <w:jc w:val="both"/>
+        <w:pStyle w:val="ListParagraph"/>
         <w:rPr>
           <w:sz w:val="20"/>
           <w:lang w:val="pt-PT"/>
         </w:rPr>
       </w:pPr>
-      <w:r>
+    </w:p>
+    <w:p>
+      <w:pPr>
         <w:rPr>
-          <w:rFonts w:cs="Segoe UI"/>
-          <w:b/>
-          <w:bCs/>
           <w:sz w:val="20"/>
           <w:szCs w:val="20"/>
           <w:lang w:val="pt-PT"/>
-        </w:rPr>
-        <w:t xml:space="preserve">Como se obtém: </w:t>
-      </w:r>
-      <w:r>
-        <w:rPr>
-          <w:rFonts w:cs="Segoe UI"/>
-          <w:sz w:val="20"/>
-          <w:szCs w:val="20"/>
-          <w:lang w:val="pt-PT"/>
-        </w:rPr>
-        <w:t xml:space="preserve">para cada KA por produzir, vê-se no MD07 a cobertura (dias de stock):</w:t>
-      </w:r>
-    </w:p>
-    <w:p>
-      <w:pPr>
-        <w:spacing w:after="40"/>
-        <w:ind w:left="1080" w:hanging="220"/>
-        <w:jc w:val="both"/>
-        <w:rPr>
-          <w:sz w:val="20"/>
-          <w:lang w:val="pt-PT"/>
-        </w:rPr>
-      </w:pPr>
-      <w:r>
-        <w:rPr>
-          <w:rFonts w:cs="Segoe UI"/>
-          <w:sz w:val="20"/>
-          <w:szCs w:val="20"/>
-          <w:lang w:val="pt-PT"/>
-        </w:rPr>
-        <w:t xml:space="preserve">– </w:t>
-      </w:r>
-      <w:r>
-        <w:rPr>
-          <w:rFonts w:cs="Segoe UI"/>
-          <w:sz w:val="20"/>
-          <w:szCs w:val="20"/>
-          <w:lang w:val="pt-PT"/>
-        </w:rPr>
-        <w:t xml:space="preserve">cobertura igual ou abaixo de 0 → o material já está em falta (falha hoje);</w:t>
-      </w:r>
-    </w:p>
-    <w:p>
-      <w:pPr>
-        <w:spacing w:after="40"/>
-        <w:ind w:left="1080" w:hanging="220"/>
-        <w:jc w:val="both"/>
-        <w:rPr>
-          <w:sz w:val="20"/>
-          <w:lang w:val="pt-PT"/>
-        </w:rPr>
-      </w:pPr>
-      <w:r>
-        <w:rPr>
-          <w:rFonts w:cs="Segoe UI"/>
-          <w:sz w:val="20"/>
-          <w:szCs w:val="20"/>
-          <w:lang w:val="pt-PT"/>
-        </w:rPr>
-        <w:t xml:space="preserve">– </w:t>
-      </w:r>
-      <w:r>
-        <w:rPr>
-          <w:rFonts w:cs="Segoe UI"/>
-          <w:sz w:val="20"/>
-          <w:szCs w:val="20"/>
-          <w:lang w:val="pt-PT"/>
-        </w:rPr>
-        <w:t xml:space="preserve">cobertura abaixo de 2 dias → vai faltar em breve; o comentário diz o dia e o turno;</w:t>
-      </w:r>
-    </w:p>
-    <w:p>
-      <w:pPr>
-        <w:spacing w:after="40"/>
-        <w:ind w:left="1080" w:hanging="220"/>
-        <w:jc w:val="both"/>
-        <w:rPr>
-          <w:sz w:val="20"/>
-          <w:lang w:val="pt-PT"/>
-        </w:rPr>
-      </w:pPr>
-      <w:r>
-        <w:rPr>
-          <w:rFonts w:cs="Segoe UI"/>
-          <w:sz w:val="20"/>
-          <w:szCs w:val="20"/>
-          <w:lang w:val="pt-PT"/>
-        </w:rPr>
-        <w:t xml:space="preserve">– </w:t>
-      </w:r>
-      <w:r>
-        <w:rPr>
-          <w:rFonts w:cs="Segoe UI"/>
-          <w:sz w:val="20"/>
-          <w:szCs w:val="20"/>
-          <w:lang w:val="pt-PT"/>
-        </w:rPr>
-        <w:t xml:space="preserve">os dias contam só dias de produção: numa sexta-feira, uma falha «amanhã» passa para segunda;</w:t>
-      </w:r>
-    </w:p>
-    <w:p>
-      <w:pPr>
-        <w:spacing w:after="40"/>
-        <w:ind w:left="1080" w:hanging="220"/>
-        <w:jc w:val="both"/>
-        <w:rPr>
-          <w:sz w:val="20"/>
-          <w:lang w:val="pt-PT"/>
-        </w:rPr>
-      </w:pPr>
-      <w:r>
-        <w:rPr>
-          <w:rFonts w:cs="Segoe UI"/>
-          <w:sz w:val="20"/>
-          <w:szCs w:val="20"/>
-          <w:lang w:val="pt-PT"/>
-        </w:rPr>
-        <w:t xml:space="preserve">– </w:t>
-      </w:r>
-      <w:r>
-        <w:rPr>
-          <w:rFonts w:cs="Segoe UI"/>
-          <w:sz w:val="20"/>
-          <w:szCs w:val="20"/>
-          <w:lang w:val="pt-PT"/>
-        </w:rPr>
-        <w:t xml:space="preserve">«Falha envio» são materiais de envio; «Falha produção» os restantes;</w:t>
-      </w:r>
-    </w:p>
-    <w:p>
-      <w:pPr>
-        <w:spacing w:after="40"/>
-        <w:ind w:left="1080" w:hanging="220"/>
-        <w:jc w:val="both"/>
-        <w:rPr>
-          <w:sz w:val="20"/>
-          <w:lang w:val="pt-PT"/>
-        </w:rPr>
-      </w:pPr>
-      <w:r>
-        <w:rPr>
-          <w:rFonts w:cs="Segoe UI"/>
-          <w:sz w:val="20"/>
-          <w:szCs w:val="20"/>
-          <w:lang w:val="pt-PT"/>
-        </w:rPr>
-        <w:t xml:space="preserve">– </w:t>
-      </w:r>
-      <w:r>
-        <w:rPr>
-          <w:rFonts w:cs="Segoe UI"/>
-          <w:sz w:val="20"/>
-          <w:szCs w:val="20"/>
-          <w:lang w:val="pt-PT"/>
-        </w:rPr>
-        <w:t xml:space="preserve">o mesmo é feito para o CO KA de cada KA (lista «KA CO» no SharePoint): se o par estiver em risco, aparece com «(CO KA de …)».</w:t>
-      </w:r>
-    </w:p>
-    <w:p>
-      <w:pPr>
-        <w:spacing w:after="60"/>
-        <w:ind w:left="720"/>
-        <w:jc w:val="both"/>
-        <w:rPr>
-          <w:sz w:val="20"/>
-          <w:lang w:val="pt-PT"/>
-        </w:rPr>
-      </w:pPr>
-      <w:r>
-        <w:rPr>
-          <w:rFonts w:cs="Segoe UI"/>
-          <w:b/>
-          <w:bCs/>
-          <w:sz w:val="20"/>
-          <w:szCs w:val="20"/>
-          <w:lang w:val="pt-PT"/>
-        </w:rPr>
-        <w:t xml:space="preserve">MD07 diário: </w:t>
-      </w:r>
-      <w:r>
-        <w:rPr>
-          <w:rFonts w:cs="Segoe UI"/>
-          <w:sz w:val="20"/>
-          <w:szCs w:val="20"/>
-          <w:lang w:val="pt-PT"/>
-        </w:rPr>
-        <w:t xml:space="preserve">o MD07 tem de ser carregado todos os dias («Carregar MD07»). Vale até às 9h do dia útil seguinte (o de sexta vale até segunda às 9h); depois disso a tabela é substituída pelo aviso «Carregar MD07 de hoje».</w:t>
-      </w:r>
-    </w:p>
-    <w:p>
-      <w:pPr>
-        <w:spacing w:after="60"/>
-        <w:ind w:left="720"/>
-        <w:jc w:val="both"/>
-        <w:rPr>
-          <w:sz w:val="20"/>
-          <w:lang w:val="pt-PT"/>
-        </w:rPr>
-      </w:pPr>
-      <w:r>
-        <w:rPr>
-          <w:rFonts w:cs="Segoe UI"/>
-          <w:b/>
-          <w:bCs/>
-          <w:sz w:val="20"/>
-          <w:szCs w:val="20"/>
-          <w:lang w:val="pt-PT"/>
-        </w:rPr>
-        <w:t xml:space="preserve">Editar a tabela: </w:t>
-      </w:r>
-      <w:r>
-        <w:rPr>
-          <w:rFonts w:cs="Segoe UI"/>
-          <w:sz w:val="20"/>
-          <w:szCs w:val="20"/>
-          <w:lang w:val="pt-PT"/>
-        </w:rPr>
-        <w:t xml:space="preserve">o lápis permite reordenar e eliminar linhas (com dupla confirmação); as linhas eliminadas voltam a aparecer quando é carregado um MD07 novo. O «+» acrescenta uma linha manual, visível para todos, que é apagada ao carregar um MD07 novo. «Atualizar CO KA» abre a lista de pares KA ↔ CO KA para edição.</w:t>
-      </w:r>
-    </w:p>
-    <w:p>
-      <w:pPr>
-        <w:pStyle w:val="ListParagraph"/>
-        <w:numPr>
-          <w:ilvl w:val="0"/>
-          <w:numId w:val="27"/>
-        </w:numPr>
-        <w:spacing w:before="240"/>
-        <w:rPr>
-          <w:sz w:val="20"/>
-          <w:lang w:val="pt-PT"/>
-        </w:rPr>
-      </w:pPr>
-      <w:r>
-        <w:rPr>
-          <w:rFonts w:cs="Segoe UI"/>
-          <w:sz w:val="20"/>
-          <w:szCs w:val="20"/>
-          <w:lang w:val="pt-PT"/>
-        </w:rPr>
-        <w:t xml:space="preserve">Verificar a </w:t>
-      </w:r>
-      <w:r>
-        <w:rPr>
-          <w:rFonts w:cs="Segoe UI"/>
-          <w:b/>
-          <w:bCs/>
-          <w:sz w:val="20"/>
-          <w:szCs w:val="20"/>
-          <w:lang w:val="pt-PT"/>
-        </w:rPr>
-        <w:t xml:space="preserve">MOD Planeada</w:t>
-      </w:r>
-      <w:r>
-        <w:rPr>
-          <w:rFonts w:cs="Segoe UI"/>
-          <w:sz w:val="20"/>
-          <w:szCs w:val="20"/>
-          <w:lang w:val="pt-PT"/>
-        </w:rPr>
-        <w:t xml:space="preserve">.</w:t>
-      </w:r>
-    </w:p>
-    <w:p>
-      <w:pPr>
-        <w:keepNext/>
-        <w:spacing w:before="120" w:after="60"/>
-        <w:jc w:val="center"/>
-      </w:pPr>
-      <w:r>
-        <w:rPr>
-          <w:noProof/>
-          <w:lang w:val="pt-PT"/>
-        </w:rPr>
-        <w:drawing>
-          <wp:inline distT="0" distB="0" distL="0" distR="0">
-            <wp:extent cx="5400000" cy="2170893"/>
-            <wp:effectExtent l="0" t="0" r="0" b="0"/>
-            <wp:docPr id="9008" name="Imagem 9008"/>
-            <wp:cNvGraphicFramePr>
-              <a:graphicFrameLocks xmlns:a="http://schemas.openxmlformats.org/drawingml/2006/main" noChangeAspect="1"/>
-            </wp:cNvGraphicFramePr>
-            <a:graphic xmlns:a="http://schemas.openxmlformats.org/drawingml/2006/main">
-              <a:graphicData uri="http://schemas.openxmlformats.org/drawingml/2006/picture">
-                <pic:pic xmlns:pic="http://schemas.openxmlformats.org/drawingml/2006/picture">
-                  <pic:nvPicPr>
-                    <pic:cNvPr id="9008" name="pvp_09_mod.png"/>
-                    <pic:cNvPicPr/>
-                  </pic:nvPicPr>
-                  <pic:blipFill>
-                    <a:blip r:embed="rId508"/>
-                    <a:stretch>
-                      <a:fillRect/>
-                    </a:stretch>
-                  </pic:blipFill>
-                  <pic:spPr>
-                    <a:xfrm>
-                      <a:off x="0" y="0"/>
-                      <a:ext cx="5400000" cy="2170893"/>
-                    </a:xfrm>
-                    <a:prstGeom prst="rect">
-                      <a:avLst/>
-                    </a:prstGeom>
-                  </pic:spPr>
-                </pic:pic>
-              </a:graphicData>
-            </a:graphic>
-          </wp:inline>
-        </w:drawing>
-      </w:r>
-    </w:p>
-    <w:p>
-      <w:pPr>
-        <w:spacing w:after="120"/>
-        <w:jc w:val="center"/>
-      </w:pPr>
-      <w:r>
-        <w:rPr>
-          <w:rFonts w:cs="Segoe UI"/>
-          <w:i/>
-          <w:iCs/>
-          <w:sz w:val="16"/>
-          <w:szCs w:val="16"/>
-          <w:lang w:val="pt-PT"/>
-        </w:rPr>
-        <w:t xml:space="preserve">MOD Planeada (clicar no título para abrir/fechar)</w:t>
-      </w:r>
-    </w:p>
-    <w:p>
-      <w:pPr>
-        <w:spacing w:after="60"/>
-        <w:ind w:left="720"/>
-        <w:jc w:val="both"/>
-        <w:rPr>
-          <w:sz w:val="20"/>
-          <w:lang w:val="pt-PT"/>
-        </w:rPr>
-      </w:pPr>
-      <w:r>
-        <w:rPr>
-          <w:rFonts w:cs="Segoe UI"/>
-          <w:b/>
-          <w:bCs/>
-          <w:sz w:val="20"/>
-          <w:szCs w:val="20"/>
-          <w:lang w:val="pt-PT"/>
-        </w:rPr>
-        <w:t xml:space="preserve">O que mostra: </w:t>
-      </w:r>
-      <w:r>
-        <w:rPr>
-          <w:rFonts w:cs="Segoe UI"/>
-          <w:sz w:val="20"/>
-          <w:szCs w:val="20"/>
-          <w:lang w:val="pt-PT"/>
-        </w:rPr>
-        <w:t xml:space="preserve">os turnos planeados por C.C. para as próximas duas semanas.</w:t>
-      </w:r>
-    </w:p>
-    <w:p>
-      <w:pPr>
-        <w:spacing w:after="60"/>
-        <w:ind w:left="720"/>
-        <w:jc w:val="both"/>
-        <w:rPr>
-          <w:sz w:val="20"/>
-          <w:lang w:val="pt-PT"/>
-        </w:rPr>
-      </w:pPr>
-      <w:r>
-        <w:rPr>
-          <w:rFonts w:cs="Segoe UI"/>
-          <w:b/>
-          <w:bCs/>
-          <w:sz w:val="20"/>
-          <w:szCs w:val="20"/>
-          <w:lang w:val="pt-PT"/>
-        </w:rPr>
-        <w:t xml:space="preserve">Como analisar: </w:t>
-      </w:r>
-      <w:r>
-        <w:rPr>
-          <w:rFonts w:cs="Segoe UI"/>
-          <w:sz w:val="20"/>
-          <w:szCs w:val="20"/>
-          <w:lang w:val="pt-PT"/>
-        </w:rPr>
-        <w:t xml:space="preserve">dia útil com turnos aparece a verde; dia útil sem turnos (atenção) e fim de semana com turnos (trabalho fora do horário normal) aparecem a laranja; fim de semana sem turnos fica a branco.</w:t>
-      </w:r>
-    </w:p>
-    <w:p>
-      <w:pPr>
-        <w:pStyle w:val="ListParagraph"/>
-        <w:numPr>
-          <w:ilvl w:val="0"/>
-          <w:numId w:val="27"/>
-        </w:numPr>
-        <w:spacing w:before="240"/>
-        <w:rPr>
-          <w:sz w:val="20"/>
-          <w:lang w:val="pt-PT"/>
-        </w:rPr>
-      </w:pPr>
-      <w:r>
-        <w:rPr>
-          <w:rFonts w:cs="Segoe UI"/>
-          <w:sz w:val="20"/>
-          <w:szCs w:val="20"/>
-          <w:lang w:val="pt-PT"/>
-        </w:rPr>
-        <w:t xml:space="preserve">Verificar a </w:t>
-      </w:r>
-      <w:r>
-        <w:rPr>
-          <w:rFonts w:cs="Segoe UI"/>
-          <w:b/>
-          <w:bCs/>
-          <w:sz w:val="20"/>
-          <w:szCs w:val="20"/>
-          <w:lang w:val="pt-PT"/>
-        </w:rPr>
-        <w:t xml:space="preserve">Previsão de Trabalho Extra</w:t>
-      </w:r>
-      <w:r>
-        <w:rPr>
-          <w:rFonts w:cs="Segoe UI"/>
-          <w:sz w:val="20"/>
-          <w:szCs w:val="20"/>
-          <w:lang w:val="pt-PT"/>
-        </w:rPr>
-        <w:t xml:space="preserve">.</w:t>
-      </w:r>
-    </w:p>
-    <w:p>
-      <w:pPr>
-        <w:keepNext/>
-        <w:spacing w:before="120" w:after="60"/>
-        <w:jc w:val="center"/>
-      </w:pPr>
-      <w:r>
-        <w:rPr>
-          <w:noProof/>
-          <w:lang w:val="pt-PT"/>
-        </w:rPr>
-        <w:drawing>
-          <wp:inline distT="0" distB="0" distL="0" distR="0">
-            <wp:extent cx="5040000" cy="2440115"/>
-            <wp:effectExtent l="0" t="0" r="0" b="0"/>
-            <wp:docPr id="9009" name="Imagem 9009"/>
-            <wp:cNvGraphicFramePr>
-              <a:graphicFrameLocks xmlns:a="http://schemas.openxmlformats.org/drawingml/2006/main" noChangeAspect="1"/>
-            </wp:cNvGraphicFramePr>
-            <a:graphic xmlns:a="http://schemas.openxmlformats.org/drawingml/2006/main">
-              <a:graphicData uri="http://schemas.openxmlformats.org/drawingml/2006/picture">
-                <pic:pic xmlns:pic="http://schemas.openxmlformats.org/drawingml/2006/picture">
-                  <pic:nvPicPr>
-                    <pic:cNvPr id="9009" name="pvp_10_te.png"/>
-                    <pic:cNvPicPr/>
-                  </pic:nvPicPr>
-                  <pic:blipFill>
-                    <a:blip r:embed="rId509"/>
-                    <a:stretch>
-                      <a:fillRect/>
-                    </a:stretch>
-                  </pic:blipFill>
-                  <pic:spPr>
-                    <a:xfrm>
-                      <a:off x="0" y="0"/>
-                      <a:ext cx="5040000" cy="2440115"/>
-                    </a:xfrm>
-                    <a:prstGeom prst="rect">
-                      <a:avLst/>
-                    </a:prstGeom>
-                  </pic:spPr>
-                </pic:pic>
-              </a:graphicData>
-            </a:graphic>
-          </wp:inline>
-        </w:drawing>
-      </w:r>
-    </w:p>
-    <w:p>
-      <w:pPr>
-        <w:spacing w:after="120"/>
-        <w:jc w:val="center"/>
-      </w:pPr>
-      <w:r>
-        <w:rPr>
-          <w:rFonts w:cs="Segoe UI"/>
-          <w:i/>
-          <w:iCs/>
-          <w:sz w:val="16"/>
-          <w:szCs w:val="16"/>
-          <w:lang w:val="pt-PT"/>
-        </w:rPr>
-        <w:t xml:space="preserve">Previsão de Trabalho Extra</w:t>
-      </w:r>
-    </w:p>
-    <w:p>
-      <w:pPr>
-        <w:spacing w:after="60"/>
-        <w:ind w:left="720"/>
-        <w:jc w:val="both"/>
-        <w:rPr>
-          <w:sz w:val="20"/>
-          <w:lang w:val="pt-PT"/>
-        </w:rPr>
-      </w:pPr>
-      <w:r>
-        <w:rPr>
-          <w:rFonts w:cs="Segoe UI"/>
-          <w:b/>
-          <w:bCs/>
-          <w:sz w:val="20"/>
-          <w:szCs w:val="20"/>
-          <w:lang w:val="pt-PT"/>
-        </w:rPr>
-        <w:t xml:space="preserve">O que mostra: </w:t>
-      </w:r>
-      <w:r>
-        <w:rPr>
-          <w:rFonts w:cs="Segoe UI"/>
-          <w:sz w:val="20"/>
-          <w:szCs w:val="20"/>
-          <w:lang w:val="pt-PT"/>
-        </w:rPr>
-        <w:t xml:space="preserve">por C.C., para a semana do período:</w:t>
-      </w:r>
-    </w:p>
-    <w:p>
-      <w:pPr>
-        <w:spacing w:after="40"/>
-        <w:ind w:left="1080" w:hanging="220"/>
-        <w:jc w:val="both"/>
-        <w:rPr>
-          <w:sz w:val="20"/>
-          <w:lang w:val="pt-PT"/>
-        </w:rPr>
-      </w:pPr>
-      <w:r>
-        <w:rPr>
-          <w:rFonts w:cs="Segoe UI"/>
-          <w:sz w:val="20"/>
-          <w:szCs w:val="20"/>
-          <w:lang w:val="pt-PT"/>
-        </w:rPr>
-        <w:t xml:space="preserve">– </w:t>
-      </w:r>
-      <w:r>
-        <w:rPr>
-          <w:rFonts w:cs="Segoe UI"/>
-          <w:b/>
-          <w:bCs/>
-          <w:sz w:val="20"/>
-          <w:szCs w:val="20"/>
-          <w:lang w:val="pt-PT"/>
-        </w:rPr>
-        <w:t xml:space="preserve">MOD</w:t>
-      </w:r>
-      <w:r>
-        <w:rPr>
-          <w:rFonts w:cs="Segoe UI"/>
-          <w:sz w:val="20"/>
-          <w:szCs w:val="20"/>
-          <w:lang w:val="pt-PT"/>
-        </w:rPr>
-        <w:t xml:space="preserve">: turnos planeados para o sábado e o domingo dessa semana;</w:t>
-      </w:r>
-    </w:p>
-    <w:p>
-      <w:pPr>
-        <w:spacing w:after="40"/>
-        <w:ind w:left="1080" w:hanging="220"/>
-        <w:jc w:val="both"/>
-        <w:rPr>
-          <w:sz w:val="20"/>
-          <w:lang w:val="pt-PT"/>
-        </w:rPr>
-      </w:pPr>
-      <w:r>
-        <w:rPr>
-          <w:rFonts w:cs="Segoe UI"/>
-          <w:sz w:val="20"/>
-          <w:szCs w:val="20"/>
-          <w:lang w:val="pt-PT"/>
-        </w:rPr>
-        <w:t xml:space="preserve">– </w:t>
-      </w:r>
-      <w:r>
-        <w:rPr>
-          <w:rFonts w:cs="Segoe UI"/>
-          <w:b/>
-          <w:bCs/>
-          <w:sz w:val="20"/>
-          <w:szCs w:val="20"/>
-          <w:lang w:val="pt-PT"/>
-        </w:rPr>
-        <w:t xml:space="preserve">Previsão</w:t>
-      </w:r>
-      <w:r>
-        <w:rPr>
-          <w:rFonts w:cs="Segoe UI"/>
-          <w:sz w:val="20"/>
-          <w:szCs w:val="20"/>
-          <w:lang w:val="pt-PT"/>
-        </w:rPr>
-        <w:t xml:space="preserve">: turnos de trabalho extra estimados — os turnos acima da abertura normal nos dias úteis e os turnos de fim de semana da MOD, mais 1 turno por cada 7,5h de atraso do C.C. (ou menos 1 por cada 7,5h de avanço). Nunca passa de 6 turnos, o máximo de um fim de semana;</w:t>
-      </w:r>
-    </w:p>
-    <w:p>
-      <w:pPr>
-        <w:spacing w:after="40"/>
-        <w:ind w:left="1080" w:hanging="220"/>
-        <w:jc w:val="both"/>
-        <w:rPr>
-          <w:sz w:val="20"/>
-          <w:lang w:val="pt-PT"/>
-        </w:rPr>
-      </w:pPr>
-      <w:r>
-        <w:rPr>
-          <w:rFonts w:cs="Segoe UI"/>
-          <w:sz w:val="20"/>
-          <w:szCs w:val="20"/>
-          <w:lang w:val="pt-PT"/>
-        </w:rPr>
-        <w:t xml:space="preserve">– </w:t>
-      </w:r>
-      <w:r>
-        <w:rPr>
-          <w:rFonts w:cs="Segoe UI"/>
-          <w:b/>
-          <w:bCs/>
-          <w:sz w:val="20"/>
-          <w:szCs w:val="20"/>
-          <w:lang w:val="pt-PT"/>
-        </w:rPr>
-        <w:t xml:space="preserve">Pedido TE</w:t>
-      </w:r>
-      <w:r>
-        <w:rPr>
-          <w:rFonts w:cs="Segoe UI"/>
-          <w:sz w:val="20"/>
-          <w:szCs w:val="20"/>
-          <w:lang w:val="pt-PT"/>
-        </w:rPr>
-        <w:t xml:space="preserve"> e </w:t>
-      </w:r>
-      <w:r>
-        <w:rPr>
-          <w:rFonts w:cs="Segoe UI"/>
-          <w:b/>
-          <w:bCs/>
-          <w:sz w:val="20"/>
-          <w:szCs w:val="20"/>
-          <w:lang w:val="pt-PT"/>
-        </w:rPr>
-        <w:t xml:space="preserve">Real TE</w:t>
-      </w:r>
-      <w:r>
-        <w:rPr>
-          <w:rFonts w:cs="Segoe UI"/>
-          <w:sz w:val="20"/>
-          <w:szCs w:val="20"/>
-          <w:lang w:val="pt-PT"/>
-        </w:rPr>
-        <w:t xml:space="preserve">: turnos pedidos e turnos preenchidos na lista «Trabalho Extra – Registos».</w:t>
-      </w:r>
-    </w:p>
-    <w:p>
-      <w:pPr>
-        <w:spacing w:after="60"/>
-        <w:ind w:left="720"/>
-        <w:jc w:val="both"/>
-        <w:rPr>
-          <w:sz w:val="20"/>
-          <w:lang w:val="pt-PT"/>
-        </w:rPr>
-      </w:pPr>
-      <w:r>
-        <w:rPr>
-          <w:rFonts w:cs="Segoe UI"/>
-          <w:b/>
-          <w:bCs/>
-          <w:sz w:val="20"/>
-          <w:szCs w:val="20"/>
-          <w:lang w:val="pt-PT"/>
-        </w:rPr>
-        <w:t xml:space="preserve">Como analisar: </w:t>
-      </w:r>
-      <w:r>
-        <w:rPr>
-          <w:rFonts w:cs="Segoe UI"/>
-          <w:sz w:val="20"/>
-          <w:szCs w:val="20"/>
-          <w:lang w:val="pt-PT"/>
-        </w:rPr>
-        <w:t xml:space="preserve">comparar a Previsão com o Pedido TE. Os números entre parênteses no cabeçalho são os totais de cada coluna.</w:t>
-      </w:r>
-    </w:p>
-    <w:p>
-      <w:pPr>
-        <w:spacing w:after="0"/>
-        <w:rPr>
-          <w:sz w:val="12"/>
         </w:rPr>
       </w:pPr>
     </w:p>
@@ -3011,6 +1304,7 @@
         </w:rPr>
         <w:t xml:space="preserve"> reportar de imediato ao </w:t>
       </w:r>
+      <w:bookmarkStart w:id="2" w:name="_Hlk173760416"/>
       <w:r>
         <w:rPr>
           <w:b/>
@@ -3021,6 +1315,7 @@
         </w:rPr>
         <w:t>responsável hierárquico superior</w:t>
       </w:r>
+      <w:bookmarkEnd w:id="2"/>
       <w:r>
         <w:rPr>
           <w:b/>
@@ -3031,448 +1326,7 @@
         </w:rPr>
         <w:t>.</w:t>
       </w:r>
-    </w:p>
-    <w:p>
-      <w:r>
-        <w:br w:type="page"/>
-      </w:r>
-    </w:p>
-    <w:p>
-      <w:pPr>
-        <w:spacing w:before="0" w:after="160"/>
-        <w:rPr>
-          <w:sz w:val="24"/>
-        </w:rPr>
-      </w:pPr>
-      <w:r>
-        <w:rPr>
-          <w:rFonts w:cs="Segoe UI"/>
-          <w:b/>
-          <w:bCs/>
-          <w:sz w:val="24"/>
-          <w:szCs w:val="24"/>
-          <w:lang w:val="pt-PT"/>
-        </w:rPr>
-        <w:t xml:space="preserve">Anexo – Histórico dos Planos de Produção</w:t>
-      </w:r>
-    </w:p>
-    <w:p>
-      <w:pPr>
-        <w:spacing w:after="60"/>
-        <w:ind w:left="0"/>
-        <w:jc w:val="both"/>
-        <w:rPr>
-          <w:sz w:val="20"/>
-          <w:lang w:val="pt-PT"/>
-        </w:rPr>
-      </w:pPr>
-      <w:r>
-        <w:rPr>
-          <w:rFonts w:cs="Segoe UI"/>
-          <w:sz w:val="20"/>
-          <w:szCs w:val="20"/>
-          <w:lang w:val="pt-PT"/>
-        </w:rPr>
-        <w:t xml:space="preserve">O botão «Histórico» (canto superior direito) abre a análise dos planos já passados. «Voltar ao Dashboard» regressa ao ecrã principal.</w:t>
-      </w:r>
-    </w:p>
-    <w:p>
-      <w:pPr>
-        <w:keepNext/>
-        <w:spacing w:before="120" w:after="60"/>
-        <w:jc w:val="center"/>
-      </w:pPr>
-      <w:r>
-        <w:rPr>
-          <w:noProof/>
-          <w:lang w:val="pt-PT"/>
-        </w:rPr>
-        <w:drawing>
-          <wp:inline distT="0" distB="0" distL="0" distR="0">
-            <wp:extent cx="6120000" cy="3442500"/>
-            <wp:effectExtent l="0" t="0" r="0" b="0"/>
-            <wp:docPr id="9010" name="Imagem 9010"/>
-            <wp:cNvGraphicFramePr>
-              <a:graphicFrameLocks xmlns:a="http://schemas.openxmlformats.org/drawingml/2006/main" noChangeAspect="1"/>
-            </wp:cNvGraphicFramePr>
-            <a:graphic xmlns:a="http://schemas.openxmlformats.org/drawingml/2006/main">
-              <a:graphicData uri="http://schemas.openxmlformats.org/drawingml/2006/picture">
-                <pic:pic xmlns:pic="http://schemas.openxmlformats.org/drawingml/2006/picture">
-                  <pic:nvPicPr>
-                    <pic:cNvPr id="9010" name="pvp_11_historico.png"/>
-                    <pic:cNvPicPr/>
-                  </pic:nvPicPr>
-                  <pic:blipFill>
-                    <a:blip r:embed="rId510"/>
-                    <a:stretch>
-                      <a:fillRect/>
-                    </a:stretch>
-                  </pic:blipFill>
-                  <pic:spPr>
-                    <a:xfrm>
-                      <a:off x="0" y="0"/>
-                      <a:ext cx="6120000" cy="3442500"/>
-                    </a:xfrm>
-                    <a:prstGeom prst="rect">
-                      <a:avLst/>
-                    </a:prstGeom>
-                  </pic:spPr>
-                </pic:pic>
-              </a:graphicData>
-            </a:graphic>
-          </wp:inline>
-        </w:drawing>
-      </w:r>
-    </w:p>
-    <w:p>
-      <w:pPr>
-        <w:spacing w:after="120"/>
-        <w:jc w:val="center"/>
-      </w:pPr>
-      <w:r>
-        <w:rPr>
-          <w:rFonts w:cs="Segoe UI"/>
-          <w:i/>
-          <w:iCs/>
-          <w:sz w:val="16"/>
-          <w:szCs w:val="16"/>
-          <w:lang w:val="pt-PT"/>
-        </w:rPr>
-        <w:t xml:space="preserve">Histórico</w:t>
-      </w:r>
-    </w:p>
-    <w:p>
-      <w:pPr>
-        <w:spacing w:after="60"/>
-        <w:ind w:left="720"/>
-        <w:jc w:val="both"/>
-        <w:rPr>
-          <w:sz w:val="20"/>
-          <w:lang w:val="pt-PT"/>
-        </w:rPr>
-      </w:pPr>
-      <w:r>
-        <w:rPr>
-          <w:rFonts w:cs="Segoe UI"/>
-          <w:b/>
-          <w:bCs/>
-          <w:sz w:val="20"/>
-          <w:szCs w:val="20"/>
-          <w:lang w:val="pt-PT"/>
-        </w:rPr>
-        <w:t xml:space="preserve">Filtros: </w:t>
-      </w:r>
-      <w:r>
-        <w:rPr>
-          <w:rFonts w:cs="Segoe UI"/>
-          <w:sz w:val="20"/>
-          <w:szCs w:val="20"/>
-          <w:lang w:val="pt-PT"/>
-        </w:rPr>
-        <w:t xml:space="preserve">período (datas, semana, mês ou ano), área, C.C. e KA. «Repor» volta aos filtros iniciais.</w:t>
-      </w:r>
-    </w:p>
-    <w:p>
-      <w:pPr>
-        <w:spacing w:after="60"/>
-        <w:ind w:left="720"/>
-        <w:jc w:val="both"/>
-        <w:rPr>
-          <w:sz w:val="20"/>
-          <w:lang w:val="pt-PT"/>
-        </w:rPr>
-      </w:pPr>
-      <w:r>
-        <w:rPr>
-          <w:rFonts w:cs="Segoe UI"/>
-          <w:b/>
-          <w:bCs/>
-          <w:sz w:val="20"/>
-          <w:szCs w:val="20"/>
-          <w:lang w:val="pt-PT"/>
-        </w:rPr>
-        <w:t xml:space="preserve">Indicadores: </w:t>
-      </w:r>
-      <w:r>
-        <w:rPr>
-          <w:rFonts w:cs="Segoe UI"/>
-          <w:sz w:val="20"/>
-          <w:szCs w:val="20"/>
-          <w:lang w:val="pt-PT"/>
-        </w:rPr>
-        <w:t xml:space="preserve"/>
-      </w:r>
-    </w:p>
-    <w:p>
-      <w:pPr>
-        <w:spacing w:after="40"/>
-        <w:ind w:left="1080" w:hanging="220"/>
-        <w:jc w:val="both"/>
-        <w:rPr>
-          <w:sz w:val="20"/>
-          <w:lang w:val="pt-PT"/>
-        </w:rPr>
-      </w:pPr>
-      <w:r>
-        <w:rPr>
-          <w:rFonts w:cs="Segoe UI"/>
-          <w:sz w:val="20"/>
-          <w:szCs w:val="20"/>
-          <w:lang w:val="pt-PT"/>
-        </w:rPr>
-        <w:t xml:space="preserve">– </w:t>
-      </w:r>
-      <w:r>
-        <w:rPr>
-          <w:rFonts w:cs="Segoe UI"/>
-          <w:b/>
-          <w:bCs/>
-          <w:sz w:val="20"/>
-          <w:szCs w:val="20"/>
-          <w:lang w:val="pt-PT"/>
-        </w:rPr>
-        <w:t xml:space="preserve">Produzido/Planeado</w:t>
-      </w:r>
-      <w:r>
-        <w:rPr>
-          <w:rFonts w:cs="Segoe UI"/>
-          <w:sz w:val="20"/>
-          <w:szCs w:val="20"/>
-          <w:lang w:val="pt-PT"/>
-        </w:rPr>
-        <w:t xml:space="preserve">: peças produzidas ÷ peças planeadas no período escolhido;</w:t>
-      </w:r>
-    </w:p>
-    <w:p>
-      <w:pPr>
-        <w:spacing w:after="40"/>
-        <w:ind w:left="1080" w:hanging="220"/>
-        <w:jc w:val="both"/>
-        <w:rPr>
-          <w:sz w:val="20"/>
-          <w:lang w:val="pt-PT"/>
-        </w:rPr>
-      </w:pPr>
-      <w:r>
-        <w:rPr>
-          <w:rFonts w:cs="Segoe UI"/>
-          <w:sz w:val="20"/>
-          <w:szCs w:val="20"/>
-          <w:lang w:val="pt-PT"/>
-        </w:rPr>
-        <w:t xml:space="preserve">– </w:t>
-      </w:r>
-      <w:r>
-        <w:rPr>
-          <w:rFonts w:cs="Segoe UI"/>
-          <w:b/>
-          <w:bCs/>
-          <w:sz w:val="20"/>
-          <w:szCs w:val="20"/>
-          <w:lang w:val="pt-PT"/>
-        </w:rPr>
-        <w:t xml:space="preserve">Qtd. Produzida / Qtd. Planeada</w:t>
-      </w:r>
-      <w:r>
-        <w:rPr>
-          <w:rFonts w:cs="Segoe UI"/>
-          <w:sz w:val="20"/>
-          <w:szCs w:val="20"/>
-          <w:lang w:val="pt-PT"/>
-        </w:rPr>
-        <w:t xml:space="preserve">: os totais de peças;</w:t>
-      </w:r>
-    </w:p>
-    <w:p>
-      <w:pPr>
-        <w:spacing w:after="40"/>
-        <w:ind w:left="1080" w:hanging="220"/>
-        <w:jc w:val="both"/>
-        <w:rPr>
-          <w:sz w:val="20"/>
-          <w:lang w:val="pt-PT"/>
-        </w:rPr>
-      </w:pPr>
-      <w:r>
-        <w:rPr>
-          <w:rFonts w:cs="Segoe UI"/>
-          <w:sz w:val="20"/>
-          <w:szCs w:val="20"/>
-          <w:lang w:val="pt-PT"/>
-        </w:rPr>
-        <w:t xml:space="preserve">– </w:t>
-      </w:r>
-      <w:r>
-        <w:rPr>
-          <w:rFonts w:cs="Segoe UI"/>
-          <w:b/>
-          <w:bCs/>
-          <w:sz w:val="20"/>
-          <w:szCs w:val="20"/>
-          <w:lang w:val="pt-PT"/>
-        </w:rPr>
-        <w:t xml:space="preserve">% Produzido no Prazo</w:t>
-      </w:r>
-      <w:r>
-        <w:rPr>
-          <w:rFonts w:cs="Segoe UI"/>
-          <w:sz w:val="20"/>
-          <w:szCs w:val="20"/>
-          <w:lang w:val="pt-PT"/>
-        </w:rPr>
-        <w:t xml:space="preserve">: dos itens produzidos, quantos foram produzidos até à data planeada;</w:t>
-      </w:r>
-    </w:p>
-    <w:p>
-      <w:pPr>
-        <w:spacing w:after="40"/>
-        <w:ind w:left="1080" w:hanging="220"/>
-        <w:jc w:val="both"/>
-        <w:rPr>
-          <w:sz w:val="20"/>
-          <w:lang w:val="pt-PT"/>
-        </w:rPr>
-      </w:pPr>
-      <w:r>
-        <w:rPr>
-          <w:rFonts w:cs="Segoe UI"/>
-          <w:sz w:val="20"/>
-          <w:szCs w:val="20"/>
-          <w:lang w:val="pt-PT"/>
-        </w:rPr>
-        <w:t xml:space="preserve">– </w:t>
-      </w:r>
-      <w:r>
-        <w:rPr>
-          <w:rFonts w:cs="Segoe UI"/>
-          <w:b/>
-          <w:bCs/>
-          <w:sz w:val="20"/>
-          <w:szCs w:val="20"/>
-          <w:lang w:val="pt-PT"/>
-        </w:rPr>
-        <w:t xml:space="preserve">Média Dias Atraso</w:t>
-      </w:r>
-      <w:r>
-        <w:rPr>
-          <w:rFonts w:cs="Segoe UI"/>
-          <w:sz w:val="20"/>
-          <w:szCs w:val="20"/>
-          <w:lang w:val="pt-PT"/>
-        </w:rPr>
-        <w:t xml:space="preserve">: em média, quantos dias depois da data planeada foram produzidos os itens que se atrasaram;</w:t>
-      </w:r>
-    </w:p>
-    <w:p>
-      <w:pPr>
-        <w:spacing w:after="40"/>
-        <w:ind w:left="1080" w:hanging="220"/>
-        <w:jc w:val="both"/>
-        <w:rPr>
-          <w:sz w:val="20"/>
-          <w:lang w:val="pt-PT"/>
-        </w:rPr>
-      </w:pPr>
-      <w:r>
-        <w:rPr>
-          <w:rFonts w:cs="Segoe UI"/>
-          <w:sz w:val="20"/>
-          <w:szCs w:val="20"/>
-          <w:lang w:val="pt-PT"/>
-        </w:rPr>
-        <w:t xml:space="preserve">– </w:t>
-      </w:r>
-      <w:r>
-        <w:rPr>
-          <w:rFonts w:cs="Segoe UI"/>
-          <w:b/>
-          <w:bCs/>
-          <w:sz w:val="20"/>
-          <w:szCs w:val="20"/>
-          <w:lang w:val="pt-PT"/>
-        </w:rPr>
-        <w:t xml:space="preserve">Caixa de Erros</w:t>
-      </w:r>
-      <w:r>
-        <w:rPr>
-          <w:rFonts w:cs="Segoe UI"/>
-          <w:sz w:val="20"/>
-          <w:szCs w:val="20"/>
-          <w:lang w:val="pt-PT"/>
-        </w:rPr>
-        <w:t xml:space="preserve">: itens marcados como Produzido sem quantidade produzida (a corrigir na lista);</w:t>
-      </w:r>
-    </w:p>
-    <w:p>
-      <w:pPr>
-        <w:spacing w:after="40"/>
-        <w:ind w:left="1080" w:hanging="220"/>
-        <w:jc w:val="both"/>
-        <w:rPr>
-          <w:sz w:val="20"/>
-          <w:lang w:val="pt-PT"/>
-        </w:rPr>
-      </w:pPr>
-      <w:r>
-        <w:rPr>
-          <w:rFonts w:cs="Segoe UI"/>
-          <w:sz w:val="20"/>
-          <w:szCs w:val="20"/>
-          <w:lang w:val="pt-PT"/>
-        </w:rPr>
-        <w:t xml:space="preserve">– </w:t>
-      </w:r>
-      <w:r>
-        <w:rPr>
-          <w:rFonts w:cs="Segoe UI"/>
-          <w:b/>
-          <w:bCs/>
-          <w:sz w:val="20"/>
-          <w:szCs w:val="20"/>
-          <w:lang w:val="pt-PT"/>
-        </w:rPr>
-        <w:t xml:space="preserve">Disponibilidade MP / FRT</w:t>
-      </w:r>
-      <w:r>
-        <w:rPr>
-          <w:rFonts w:cs="Segoe UI"/>
-          <w:sz w:val="20"/>
-          <w:szCs w:val="20"/>
-          <w:lang w:val="pt-PT"/>
-        </w:rPr>
-        <w:t xml:space="preserve">: percentagem de itens com matéria-prima e ferramenta OK.</w:t>
-      </w:r>
-    </w:p>
-    <w:p>
-      <w:pPr>
-        <w:spacing w:after="60"/>
-        <w:ind w:left="720"/>
-        <w:jc w:val="both"/>
-        <w:rPr>
-          <w:sz w:val="20"/>
-          <w:lang w:val="pt-PT"/>
-        </w:rPr>
-      </w:pPr>
-      <w:r>
-        <w:rPr>
-          <w:rFonts w:cs="Segoe UI"/>
-          <w:b/>
-          <w:bCs/>
-          <w:sz w:val="20"/>
-          <w:szCs w:val="20"/>
-          <w:lang w:val="pt-PT"/>
-        </w:rPr>
-        <w:t xml:space="preserve">Gráficos: </w:t>
-      </w:r>
-      <w:r>
-        <w:rPr>
-          <w:rFonts w:cs="Segoe UI"/>
-          <w:sz w:val="20"/>
-          <w:szCs w:val="20"/>
-          <w:lang w:val="pt-PT"/>
-        </w:rPr>
-        <w:t xml:space="preserve">evolução das quantidades no tempo, desempenho por área e por C.C. (clicar numa área filtra o gráfico dos C.C.), pontualidade, interrupções, causa raiz dos desvios, nº de produções e média de bobines por produção.</w:t>
-      </w:r>
+      <w:bookmarkEnd w:id="1"/>
     </w:p>
     <w:sectPr>
       <w:headerReference w:type="default" r:id="rId21"/>

</xml_diff>